<commit_message>
Update screenshots and help docs.
</commit_message>
<xml_diff>
--- a/Help.docx
+++ b/Help.docx
@@ -77,10 +77,10 @@
           <w:lang w:val="en-US"/>
         </w:rPr>
         <w:drawing>
-          <wp:inline distT="0" distB="0" distL="0" distR="0" wp14:anchorId="64A36E30" wp14:editId="58A6409B">
-            <wp:extent cx="8229600" cy="4457700"/>
+          <wp:inline distT="0" distB="0" distL="0" distR="0" wp14:anchorId="6096A6E5" wp14:editId="24E72018">
+            <wp:extent cx="6858000" cy="3698875"/>
             <wp:effectExtent l="0" t="0" r="0" b="0"/>
-            <wp:docPr id="384281974" name="Picture 1"/>
+            <wp:docPr id="318263849" name="Picture 1"/>
             <wp:cNvGraphicFramePr>
               <a:graphicFrameLocks xmlns:a="http://schemas.openxmlformats.org/drawingml/2006/main" noChangeAspect="1"/>
             </wp:cNvGraphicFramePr>
@@ -88,7 +88,7 @@
               <a:graphicData uri="http://schemas.openxmlformats.org/drawingml/2006/picture">
                 <pic:pic xmlns:pic="http://schemas.openxmlformats.org/drawingml/2006/picture">
                   <pic:nvPicPr>
-                    <pic:cNvPr id="0" name="Picture 3"/>
+                    <pic:cNvPr id="0" name="Picture 1"/>
                     <pic:cNvPicPr>
                       <a:picLocks noChangeAspect="1" noChangeArrowheads="1"/>
                     </pic:cNvPicPr>
@@ -109,7 +109,7 @@
                   <pic:spPr bwMode="auto">
                     <a:xfrm>
                       <a:off x="0" y="0"/>
-                      <a:ext cx="8229600" cy="4457700"/>
+                      <a:ext cx="6858000" cy="3698875"/>
                     </a:xfrm>
                     <a:prstGeom prst="rect">
                       <a:avLst/>
@@ -1124,14 +1124,12 @@
       <w:r>
         <w:rPr>
           <w:noProof/>
-          <w:sz w:val="24"/>
-          <w:szCs w:val="24"/>
         </w:rPr>
         <w:drawing>
-          <wp:inline distT="0" distB="0" distL="0" distR="0" wp14:anchorId="30E87FEC" wp14:editId="16C4A0F0">
-            <wp:extent cx="2066925" cy="1990725"/>
-            <wp:effectExtent l="0" t="0" r="9525" b="9525"/>
-            <wp:docPr id="1528059001" name="Picture 4"/>
+          <wp:inline distT="0" distB="0" distL="0" distR="0" wp14:anchorId="0CBEE6D0" wp14:editId="12A963AD">
+            <wp:extent cx="2066667" cy="2495238"/>
+            <wp:effectExtent l="0" t="0" r="0" b="635"/>
+            <wp:docPr id="867894487" name="Picture 1"/>
             <wp:cNvGraphicFramePr>
               <a:graphicFrameLocks xmlns:a="http://schemas.openxmlformats.org/drawingml/2006/main" noChangeAspect="1"/>
             </wp:cNvGraphicFramePr>
@@ -1139,36 +1137,23 @@
               <a:graphicData uri="http://schemas.openxmlformats.org/drawingml/2006/picture">
                 <pic:pic xmlns:pic="http://schemas.openxmlformats.org/drawingml/2006/picture">
                   <pic:nvPicPr>
-                    <pic:cNvPr id="0" name="Picture 9"/>
-                    <pic:cNvPicPr>
-                      <a:picLocks noChangeAspect="1" noChangeArrowheads="1"/>
-                    </pic:cNvPicPr>
+                    <pic:cNvPr id="867894487" name=""/>
+                    <pic:cNvPicPr/>
                   </pic:nvPicPr>
                   <pic:blipFill>
-                    <a:blip r:embed="rId10">
-                      <a:extLst>
-                        <a:ext uri="{28A0092B-C50C-407E-A947-70E740481C1C}">
-                          <a14:useLocalDpi xmlns:a14="http://schemas.microsoft.com/office/drawing/2010/main" val="0"/>
-                        </a:ext>
-                      </a:extLst>
-                    </a:blip>
-                    <a:srcRect/>
+                    <a:blip r:embed="rId10"/>
                     <a:stretch>
                       <a:fillRect/>
                     </a:stretch>
                   </pic:blipFill>
-                  <pic:spPr bwMode="auto">
+                  <pic:spPr>
                     <a:xfrm>
                       <a:off x="0" y="0"/>
-                      <a:ext cx="2066925" cy="1990725"/>
+                      <a:ext cx="2066667" cy="2495238"/>
                     </a:xfrm>
                     <a:prstGeom prst="rect">
                       <a:avLst/>
                     </a:prstGeom>
-                    <a:noFill/>
-                    <a:ln>
-                      <a:noFill/>
-                    </a:ln>
                   </pic:spPr>
                 </pic:pic>
               </a:graphicData>
@@ -1643,10 +1628,10 @@
           <w:lang w:val="en-US"/>
         </w:rPr>
         <w:drawing>
-          <wp:inline distT="0" distB="0" distL="0" distR="0" wp14:anchorId="5F43AD59" wp14:editId="4F31898D">
-            <wp:extent cx="2181225" cy="2828925"/>
-            <wp:effectExtent l="0" t="0" r="9525" b="9525"/>
-            <wp:docPr id="2013303970" name="Picture 3"/>
+          <wp:inline distT="0" distB="0" distL="0" distR="0" wp14:anchorId="767C4422" wp14:editId="02EBA32B">
+            <wp:extent cx="2343150" cy="3124200"/>
+            <wp:effectExtent l="0" t="0" r="0" b="0"/>
+            <wp:docPr id="1890172608" name="Picture 2" descr="A screenshot of a computer program&#10;&#10;AI-generated content may be incorrect."/>
             <wp:cNvGraphicFramePr>
               <a:graphicFrameLocks xmlns:a="http://schemas.openxmlformats.org/drawingml/2006/main" noChangeAspect="1"/>
             </wp:cNvGraphicFramePr>
@@ -1654,7 +1639,7 @@
               <a:graphicData uri="http://schemas.openxmlformats.org/drawingml/2006/picture">
                 <pic:pic xmlns:pic="http://schemas.openxmlformats.org/drawingml/2006/picture">
                   <pic:nvPicPr>
-                    <pic:cNvPr id="0" name="Picture 8"/>
+                    <pic:cNvPr id="1890172608" name="Picture 2" descr="A screenshot of a computer program&#10;&#10;AI-generated content may be incorrect."/>
                     <pic:cNvPicPr>
                       <a:picLocks noChangeAspect="1" noChangeArrowheads="1"/>
                     </pic:cNvPicPr>
@@ -1675,7 +1660,7 @@
                   <pic:spPr bwMode="auto">
                     <a:xfrm>
                       <a:off x="0" y="0"/>
-                      <a:ext cx="2181225" cy="2828925"/>
+                      <a:ext cx="2343150" cy="3124200"/>
                     </a:xfrm>
                     <a:prstGeom prst="rect">
                       <a:avLst/>
@@ -2134,6 +2119,180 @@
             </w:pPr>
             <w:r>
               <w:t>Please go through the below information</w:t>
+            </w:r>
+          </w:p>
+        </w:tc>
+      </w:tr>
+      <w:tr>
+        <w:tc>
+          <w:tcPr>
+            <w:cnfStyle w:val="001000000000" w:firstRow="0" w:lastRow="0" w:firstColumn="1" w:lastColumn="0" w:oddVBand="0" w:evenVBand="0" w:oddHBand="0" w:evenHBand="0" w:firstRowFirstColumn="0" w:firstRowLastColumn="0" w:lastRowFirstColumn="0" w:lastRowLastColumn="0"/>
+            <w:tcW w:w="2830" w:type="dxa"/>
+            <w:tcBorders>
+              <w:top w:val="single" w:sz="4" w:space="0" w:color="C9C9C9" w:themeColor="accent3" w:themeTint="99"/>
+              <w:left w:val="single" w:sz="4" w:space="0" w:color="C9C9C9" w:themeColor="accent3" w:themeTint="99"/>
+              <w:bottom w:val="single" w:sz="4" w:space="0" w:color="C9C9C9" w:themeColor="accent3" w:themeTint="99"/>
+              <w:right w:val="single" w:sz="4" w:space="0" w:color="C9C9C9" w:themeColor="accent3" w:themeTint="99"/>
+            </w:tcBorders>
+          </w:tcPr>
+          <w:p>
+            <w:pPr>
+              <w:pStyle w:val="NoSpacing"/>
+            </w:pPr>
+            <w:r>
+              <w:t>Close All Windows</w:t>
+            </w:r>
+          </w:p>
+        </w:tc>
+        <w:tc>
+          <w:tcPr>
+            <w:tcW w:w="7938" w:type="dxa"/>
+            <w:tcBorders>
+              <w:top w:val="single" w:sz="4" w:space="0" w:color="C9C9C9" w:themeColor="accent3" w:themeTint="99"/>
+              <w:left w:val="single" w:sz="4" w:space="0" w:color="C9C9C9" w:themeColor="accent3" w:themeTint="99"/>
+              <w:bottom w:val="single" w:sz="4" w:space="0" w:color="C9C9C9" w:themeColor="accent3" w:themeTint="99"/>
+              <w:right w:val="single" w:sz="4" w:space="0" w:color="C9C9C9" w:themeColor="accent3" w:themeTint="99"/>
+            </w:tcBorders>
+          </w:tcPr>
+          <w:p>
+            <w:pPr>
+              <w:pStyle w:val="NoSpacing"/>
+              <w:cnfStyle w:val="000000000000" w:firstRow="0" w:lastRow="0" w:firstColumn="0" w:lastColumn="0" w:oddVBand="0" w:evenVBand="0" w:oddHBand="0" w:evenHBand="0" w:firstRowFirstColumn="0" w:firstRowLastColumn="0" w:lastRowFirstColumn="0" w:lastRowLastColumn="0"/>
+            </w:pPr>
+            <w:r>
+              <w:t>Close all windows</w:t>
+            </w:r>
+          </w:p>
+        </w:tc>
+      </w:tr>
+      <w:tr>
+        <w:trPr>
+          <w:cnfStyle w:val="000000100000" w:firstRow="0" w:lastRow="0" w:firstColumn="0" w:lastColumn="0" w:oddVBand="0" w:evenVBand="0" w:oddHBand="1" w:evenHBand="0" w:firstRowFirstColumn="0" w:firstRowLastColumn="0" w:lastRowFirstColumn="0" w:lastRowLastColumn="0"/>
+        </w:trPr>
+        <w:tc>
+          <w:tcPr>
+            <w:cnfStyle w:val="001000000000" w:firstRow="0" w:lastRow="0" w:firstColumn="1" w:lastColumn="0" w:oddVBand="0" w:evenVBand="0" w:oddHBand="0" w:evenHBand="0" w:firstRowFirstColumn="0" w:firstRowLastColumn="0" w:lastRowFirstColumn="0" w:lastRowLastColumn="0"/>
+            <w:tcW w:w="2830" w:type="dxa"/>
+            <w:tcBorders>
+              <w:top w:val="single" w:sz="4" w:space="0" w:color="C9C9C9" w:themeColor="accent3" w:themeTint="99"/>
+              <w:left w:val="single" w:sz="4" w:space="0" w:color="C9C9C9" w:themeColor="accent3" w:themeTint="99"/>
+              <w:bottom w:val="single" w:sz="4" w:space="0" w:color="C9C9C9" w:themeColor="accent3" w:themeTint="99"/>
+              <w:right w:val="single" w:sz="4" w:space="0" w:color="C9C9C9" w:themeColor="accent3" w:themeTint="99"/>
+            </w:tcBorders>
+          </w:tcPr>
+          <w:p>
+            <w:pPr>
+              <w:pStyle w:val="NoSpacing"/>
+            </w:pPr>
+            <w:r>
+              <w:t>Reload AltTabSettings.ini</w:t>
+            </w:r>
+          </w:p>
+        </w:tc>
+        <w:tc>
+          <w:tcPr>
+            <w:tcW w:w="7938" w:type="dxa"/>
+            <w:tcBorders>
+              <w:top w:val="single" w:sz="4" w:space="0" w:color="C9C9C9" w:themeColor="accent3" w:themeTint="99"/>
+              <w:left w:val="single" w:sz="4" w:space="0" w:color="C9C9C9" w:themeColor="accent3" w:themeTint="99"/>
+              <w:bottom w:val="single" w:sz="4" w:space="0" w:color="C9C9C9" w:themeColor="accent3" w:themeTint="99"/>
+              <w:right w:val="single" w:sz="4" w:space="0" w:color="C9C9C9" w:themeColor="accent3" w:themeTint="99"/>
+            </w:tcBorders>
+          </w:tcPr>
+          <w:p>
+            <w:pPr>
+              <w:pStyle w:val="NoSpacing"/>
+              <w:cnfStyle w:val="000000100000" w:firstRow="0" w:lastRow="0" w:firstColumn="0" w:lastColumn="0" w:oddVBand="0" w:evenVBand="0" w:oddHBand="1" w:evenHBand="0" w:firstRowFirstColumn="0" w:firstRowLastColumn="0" w:lastRowFirstColumn="0" w:lastRowLastColumn="0"/>
+            </w:pPr>
+            <w:r>
+              <w:t>Reload the AltTab applications settings (useful when settings are modified manually)</w:t>
+            </w:r>
+          </w:p>
+        </w:tc>
+      </w:tr>
+      <w:tr>
+        <w:tc>
+          <w:tcPr>
+            <w:cnfStyle w:val="001000000000" w:firstRow="0" w:lastRow="0" w:firstColumn="1" w:lastColumn="0" w:oddVBand="0" w:evenVBand="0" w:oddHBand="0" w:evenHBand="0" w:firstRowFirstColumn="0" w:firstRowLastColumn="0" w:lastRowFirstColumn="0" w:lastRowLastColumn="0"/>
+            <w:tcW w:w="2830" w:type="dxa"/>
+            <w:tcBorders>
+              <w:top w:val="single" w:sz="4" w:space="0" w:color="C9C9C9" w:themeColor="accent3" w:themeTint="99"/>
+              <w:left w:val="single" w:sz="4" w:space="0" w:color="C9C9C9" w:themeColor="accent3" w:themeTint="99"/>
+              <w:bottom w:val="single" w:sz="4" w:space="0" w:color="C9C9C9" w:themeColor="accent3" w:themeTint="99"/>
+              <w:right w:val="single" w:sz="4" w:space="0" w:color="C9C9C9" w:themeColor="accent3" w:themeTint="99"/>
+            </w:tcBorders>
+          </w:tcPr>
+          <w:p>
+            <w:pPr>
+              <w:pStyle w:val="NoSpacing"/>
+            </w:pPr>
+            <w:r>
+              <w:t>Restart</w:t>
+            </w:r>
+          </w:p>
+        </w:tc>
+        <w:tc>
+          <w:tcPr>
+            <w:tcW w:w="7938" w:type="dxa"/>
+            <w:tcBorders>
+              <w:top w:val="single" w:sz="4" w:space="0" w:color="C9C9C9" w:themeColor="accent3" w:themeTint="99"/>
+              <w:left w:val="single" w:sz="4" w:space="0" w:color="C9C9C9" w:themeColor="accent3" w:themeTint="99"/>
+              <w:bottom w:val="single" w:sz="4" w:space="0" w:color="C9C9C9" w:themeColor="accent3" w:themeTint="99"/>
+              <w:right w:val="single" w:sz="4" w:space="0" w:color="C9C9C9" w:themeColor="accent3" w:themeTint="99"/>
+            </w:tcBorders>
+          </w:tcPr>
+          <w:p>
+            <w:pPr>
+              <w:pStyle w:val="NoSpacing"/>
+              <w:cnfStyle w:val="000000000000" w:firstRow="0" w:lastRow="0" w:firstColumn="0" w:lastColumn="0" w:oddVBand="0" w:evenVBand="0" w:oddHBand="0" w:evenHBand="0" w:firstRowFirstColumn="0" w:firstRowLastColumn="0" w:lastRowFirstColumn="0" w:lastRowLastColumn="0"/>
+            </w:pPr>
+            <w:r>
+              <w:t>Restart AltTab application</w:t>
+            </w:r>
+          </w:p>
+        </w:tc>
+      </w:tr>
+      <w:tr>
+        <w:trPr>
+          <w:cnfStyle w:val="000000100000" w:firstRow="0" w:lastRow="0" w:firstColumn="0" w:lastColumn="0" w:oddVBand="0" w:evenVBand="0" w:oddHBand="1" w:evenHBand="0" w:firstRowFirstColumn="0" w:firstRowLastColumn="0" w:lastRowFirstColumn="0" w:lastRowLastColumn="0"/>
+        </w:trPr>
+        <w:tc>
+          <w:tcPr>
+            <w:cnfStyle w:val="001000000000" w:firstRow="0" w:lastRow="0" w:firstColumn="1" w:lastColumn="0" w:oddVBand="0" w:evenVBand="0" w:oddHBand="0" w:evenHBand="0" w:firstRowFirstColumn="0" w:firstRowLastColumn="0" w:lastRowFirstColumn="0" w:lastRowLastColumn="0"/>
+            <w:tcW w:w="2830" w:type="dxa"/>
+            <w:tcBorders>
+              <w:top w:val="single" w:sz="4" w:space="0" w:color="C9C9C9" w:themeColor="accent3" w:themeTint="99"/>
+              <w:left w:val="single" w:sz="4" w:space="0" w:color="C9C9C9" w:themeColor="accent3" w:themeTint="99"/>
+              <w:bottom w:val="single" w:sz="4" w:space="0" w:color="C9C9C9" w:themeColor="accent3" w:themeTint="99"/>
+              <w:right w:val="single" w:sz="4" w:space="0" w:color="C9C9C9" w:themeColor="accent3" w:themeTint="99"/>
+            </w:tcBorders>
+          </w:tcPr>
+          <w:p>
+            <w:pPr>
+              <w:pStyle w:val="NoSpacing"/>
+            </w:pPr>
+            <w:r>
+              <w:t>Exit</w:t>
+            </w:r>
+          </w:p>
+        </w:tc>
+        <w:tc>
+          <w:tcPr>
+            <w:tcW w:w="7938" w:type="dxa"/>
+            <w:tcBorders>
+              <w:top w:val="single" w:sz="4" w:space="0" w:color="C9C9C9" w:themeColor="accent3" w:themeTint="99"/>
+              <w:left w:val="single" w:sz="4" w:space="0" w:color="C9C9C9" w:themeColor="accent3" w:themeTint="99"/>
+              <w:bottom w:val="single" w:sz="4" w:space="0" w:color="C9C9C9" w:themeColor="accent3" w:themeTint="99"/>
+              <w:right w:val="single" w:sz="4" w:space="0" w:color="C9C9C9" w:themeColor="accent3" w:themeTint="99"/>
+            </w:tcBorders>
+          </w:tcPr>
+          <w:p>
+            <w:pPr>
+              <w:pStyle w:val="NoSpacing"/>
+              <w:cnfStyle w:val="000000100000" w:firstRow="0" w:lastRow="0" w:firstColumn="0" w:lastColumn="0" w:oddVBand="0" w:evenVBand="0" w:oddHBand="1" w:evenHBand="0" w:firstRowFirstColumn="0" w:firstRowLastColumn="0" w:lastRowFirstColumn="0" w:lastRowLastColumn="0"/>
+            </w:pPr>
+            <w:r>
+              <w:t>Exit AltTab</w:t>
             </w:r>
           </w:p>
         </w:tc>
@@ -2342,10 +2501,10 @@
           <w:noProof/>
         </w:rPr>
         <w:drawing>
-          <wp:inline distT="0" distB="0" distL="0" distR="0" wp14:anchorId="36C5B01D" wp14:editId="0D153902">
-            <wp:extent cx="2342857" cy="2828571"/>
-            <wp:effectExtent l="0" t="0" r="635" b="0"/>
-            <wp:docPr id="1957941647" name="Picture 1"/>
+          <wp:inline distT="0" distB="0" distL="0" distR="0" wp14:anchorId="405BF6C8" wp14:editId="14DF347A">
+            <wp:extent cx="2343150" cy="3124200"/>
+            <wp:effectExtent l="0" t="0" r="0" b="0"/>
+            <wp:docPr id="870578883" name="Picture 3"/>
             <wp:cNvGraphicFramePr>
               <a:graphicFrameLocks xmlns:a="http://schemas.openxmlformats.org/drawingml/2006/main" noChangeAspect="1"/>
             </wp:cNvGraphicFramePr>
@@ -2353,23 +2512,36 @@
               <a:graphicData uri="http://schemas.openxmlformats.org/drawingml/2006/picture">
                 <pic:pic xmlns:pic="http://schemas.openxmlformats.org/drawingml/2006/picture">
                   <pic:nvPicPr>
-                    <pic:cNvPr id="1957941647" name=""/>
-                    <pic:cNvPicPr/>
+                    <pic:cNvPr id="0" name="Picture 3"/>
+                    <pic:cNvPicPr>
+                      <a:picLocks noChangeAspect="1" noChangeArrowheads="1"/>
+                    </pic:cNvPicPr>
                   </pic:nvPicPr>
                   <pic:blipFill>
-                    <a:blip r:embed="rId13"/>
+                    <a:blip r:embed="rId11">
+                      <a:extLst>
+                        <a:ext uri="{28A0092B-C50C-407E-A947-70E740481C1C}">
+                          <a14:useLocalDpi xmlns:a14="http://schemas.microsoft.com/office/drawing/2010/main" val="0"/>
+                        </a:ext>
+                      </a:extLst>
+                    </a:blip>
+                    <a:srcRect/>
                     <a:stretch>
                       <a:fillRect/>
                     </a:stretch>
                   </pic:blipFill>
-                  <pic:spPr>
+                  <pic:spPr bwMode="auto">
                     <a:xfrm>
                       <a:off x="0" y="0"/>
-                      <a:ext cx="2342857" cy="2828571"/>
+                      <a:ext cx="2343150" cy="3124200"/>
                     </a:xfrm>
                     <a:prstGeom prst="rect">
                       <a:avLst/>
                     </a:prstGeom>
+                    <a:noFill/>
+                    <a:ln>
+                      <a:noFill/>
+                    </a:ln>
                   </pic:spPr>
                 </pic:pic>
               </a:graphicData>
@@ -2415,7 +2587,7 @@
                     <pic:cNvPicPr/>
                   </pic:nvPicPr>
                   <pic:blipFill>
-                    <a:blip r:embed="rId14"/>
+                    <a:blip r:embed="rId13"/>
                     <a:stretch>
                       <a:fillRect/>
                     </a:stretch>
@@ -2521,7 +2693,7 @@
                     <pic:cNvPicPr/>
                   </pic:nvPicPr>
                   <pic:blipFill>
-                    <a:blip r:embed="rId15"/>
+                    <a:blip r:embed="rId14"/>
                     <a:stretch>
                       <a:fillRect/>
                     </a:stretch>
@@ -2616,7 +2788,7 @@
                     <pic:cNvPicPr/>
                   </pic:nvPicPr>
                   <pic:blipFill>
-                    <a:blip r:embed="rId16"/>
+                    <a:blip r:embed="rId15"/>
                     <a:stretch>
                       <a:fillRect/>
                     </a:stretch>
@@ -2801,7 +2973,7 @@
               </w:rPr>
               <w:t xml:space="preserve">Reference: </w:t>
             </w:r>
-            <w:hyperlink r:id="rId17" w:history="1">
+            <w:hyperlink r:id="rId16" w:history="1">
               <w:r>
                 <w:rPr>
                   <w:rStyle w:val="Hyperlink"/>
@@ -2812,7 +2984,7 @@
             <w:r>
               <w:t xml:space="preserve">, </w:t>
             </w:r>
-            <w:hyperlink r:id="rId18" w:history="1">
+            <w:hyperlink r:id="rId17" w:history="1">
               <w:r>
                 <w:rPr>
                   <w:rStyle w:val="Hyperlink"/>

</xml_diff>

<commit_message>
Updated screenshots and help file.
</commit_message>
<xml_diff>
--- a/Help.docx
+++ b/Help.docx
@@ -157,10 +157,10 @@
           <w:lang w:val="en-US"/>
         </w:rPr>
         <w:drawing>
-          <wp:inline distT="0" distB="0" distL="0" distR="0" wp14:anchorId="6096A6E5" wp14:editId="24E72018">
-            <wp:extent cx="6858000" cy="3698875"/>
+          <wp:inline distT="0" distB="0" distL="0" distR="0" wp14:anchorId="24ACBE44" wp14:editId="16E1B04F">
+            <wp:extent cx="6858000" cy="4755515"/>
             <wp:effectExtent l="0" t="0" r="0" b="0"/>
-            <wp:docPr id="318263849" name="Picture 1"/>
+            <wp:docPr id="874988650" name="Picture 1" descr="A screenshot of a computer&#10;&#10;AI-generated content may be incorrect."/>
             <wp:cNvGraphicFramePr>
               <a:graphicFrameLocks xmlns:a="http://schemas.openxmlformats.org/drawingml/2006/main" noChangeAspect="1"/>
             </wp:cNvGraphicFramePr>
@@ -168,7 +168,7 @@
               <a:graphicData uri="http://schemas.openxmlformats.org/drawingml/2006/picture">
                 <pic:pic xmlns:pic="http://schemas.openxmlformats.org/drawingml/2006/picture">
                   <pic:nvPicPr>
-                    <pic:cNvPr id="0" name="Picture 1"/>
+                    <pic:cNvPr id="874988650" name="Picture 1" descr="A screenshot of a computer&#10;&#10;AI-generated content may be incorrect."/>
                     <pic:cNvPicPr>
                       <a:picLocks noChangeAspect="1" noChangeArrowheads="1"/>
                     </pic:cNvPicPr>
@@ -189,7 +189,7 @@
                   <pic:spPr bwMode="auto">
                     <a:xfrm>
                       <a:off x="0" y="0"/>
-                      <a:ext cx="6858000" cy="3698875"/>
+                      <a:ext cx="6858000" cy="4755515"/>
                     </a:xfrm>
                     <a:prstGeom prst="rect">
                       <a:avLst/>
@@ -426,6 +426,7 @@
         <w:rPr>
           <w:lang w:val="en-US"/>
         </w:rPr>
+        <w:lastRenderedPageBreak/>
         <w:t>Exclude processes.</w:t>
       </w:r>
     </w:p>
@@ -496,7 +497,6 @@
         <w:rPr>
           <w:lang w:val="en-US"/>
         </w:rPr>
-        <w:lastRenderedPageBreak/>
         <w:t>Switch between windows of the same application using Alt+(Accent/Backtick)</w:t>
       </w:r>
     </w:p>
@@ -509,12 +509,13 @@
       <w:r>
         <w:rPr>
           <w:noProof/>
+          <w:lang w:val="en-US"/>
         </w:rPr>
         <w:drawing>
-          <wp:inline distT="0" distB="0" distL="0" distR="0" wp14:anchorId="70F82110" wp14:editId="7A195992">
-            <wp:extent cx="6858000" cy="1247775"/>
-            <wp:effectExtent l="0" t="0" r="0" b="9525"/>
-            <wp:docPr id="2" name="Picture 2" descr="A blue line on a black background&#10;&#10;Description automatically generated"/>
+          <wp:inline distT="0" distB="0" distL="0" distR="0" wp14:anchorId="182DDFA7" wp14:editId="2F68BA66">
+            <wp:extent cx="6858000" cy="930910"/>
+            <wp:effectExtent l="0" t="0" r="0" b="2540"/>
+            <wp:docPr id="78171788" name="Picture 2" descr="A blue line on a black background&#10;&#10;AI-generated content may be incorrect."/>
             <wp:cNvGraphicFramePr>
               <a:graphicFrameLocks xmlns:a="http://schemas.openxmlformats.org/drawingml/2006/main" noChangeAspect="1"/>
             </wp:cNvGraphicFramePr>
@@ -522,7 +523,7 @@
               <a:graphicData uri="http://schemas.openxmlformats.org/drawingml/2006/picture">
                 <pic:pic xmlns:pic="http://schemas.openxmlformats.org/drawingml/2006/picture">
                   <pic:nvPicPr>
-                    <pic:cNvPr id="0" name="Picture 2" descr="A blue line on a black background&#10;&#10;Description automatically generated"/>
+                    <pic:cNvPr id="78171788" name="Picture 2" descr="A blue line on a black background&#10;&#10;AI-generated content may be incorrect."/>
                     <pic:cNvPicPr>
                       <a:picLocks noChangeAspect="1" noChangeArrowheads="1"/>
                     </pic:cNvPicPr>
@@ -543,7 +544,7 @@
                   <pic:spPr bwMode="auto">
                     <a:xfrm>
                       <a:off x="0" y="0"/>
-                      <a:ext cx="6858000" cy="1247775"/>
+                      <a:ext cx="6858000" cy="930910"/>
                     </a:xfrm>
                     <a:prstGeom prst="rect">
                       <a:avLst/>
@@ -611,12 +612,13 @@
       <w:r>
         <w:rPr>
           <w:noProof/>
+          <w:lang w:val="en-US"/>
         </w:rPr>
         <w:drawing>
-          <wp:inline distT="0" distB="0" distL="0" distR="0" wp14:anchorId="398E327F" wp14:editId="1F3400BD">
-            <wp:extent cx="6858000" cy="1504950"/>
+          <wp:inline distT="0" distB="0" distL="0" distR="0" wp14:anchorId="7060FC5D" wp14:editId="590E3CC7">
+            <wp:extent cx="6858000" cy="1437005"/>
             <wp:effectExtent l="0" t="0" r="0" b="0"/>
-            <wp:docPr id="3" name="Picture 3" descr="A blue line on a black background&#10;&#10;Description automatically generated"/>
+            <wp:docPr id="670069014" name="Picture 3" descr="A screenshot of a computer program&#10;&#10;AI-generated content may be incorrect."/>
             <wp:cNvGraphicFramePr>
               <a:graphicFrameLocks xmlns:a="http://schemas.openxmlformats.org/drawingml/2006/main" noChangeAspect="1"/>
             </wp:cNvGraphicFramePr>
@@ -624,7 +626,7 @@
               <a:graphicData uri="http://schemas.openxmlformats.org/drawingml/2006/picture">
                 <pic:pic xmlns:pic="http://schemas.openxmlformats.org/drawingml/2006/picture">
                   <pic:nvPicPr>
-                    <pic:cNvPr id="0" name="Picture 3" descr="A blue line on a black background&#10;&#10;Description automatically generated"/>
+                    <pic:cNvPr id="670069014" name="Picture 3" descr="A screenshot of a computer program&#10;&#10;AI-generated content may be incorrect."/>
                     <pic:cNvPicPr>
                       <a:picLocks noChangeAspect="1" noChangeArrowheads="1"/>
                     </pic:cNvPicPr>
@@ -645,7 +647,7 @@
                   <pic:spPr bwMode="auto">
                     <a:xfrm>
                       <a:off x="0" y="0"/>
-                      <a:ext cx="6858000" cy="1504950"/>
+                      <a:ext cx="6858000" cy="1437005"/>
                     </a:xfrm>
                     <a:prstGeom prst="rect">
                       <a:avLst/>
@@ -1253,6 +1255,26 @@
         </w:rPr>
         <w:lastRenderedPageBreak/>
         <w:t>Context Menu</w:t>
+      </w:r>
+      <w:r>
+        <w:rPr>
+          <w:lang w:val="en-US"/>
+        </w:rPr>
+        <w:t xml:space="preserve"> on window item (</w:t>
+      </w:r>
+      <w:proofErr w:type="spellStart"/>
+      <w:r>
+        <w:rPr>
+          <w:lang w:val="en-US"/>
+        </w:rPr>
+        <w:t>ListView</w:t>
+      </w:r>
+      <w:proofErr w:type="spellEnd"/>
+      <w:r>
+        <w:rPr>
+          <w:lang w:val="en-US"/>
+        </w:rPr>
+        <w:t>)</w:t>
       </w:r>
     </w:p>
     <w:p>
@@ -1822,6 +1844,81 @@
         </w:drawing>
       </w:r>
     </w:p>
+    <w:p>
+      <w:pPr>
+        <w:rPr>
+          <w:lang w:val="en-US"/>
+        </w:rPr>
+      </w:pPr>
+      <w:r>
+        <w:rPr>
+          <w:lang w:val="en-US"/>
+        </w:rPr>
+        <w:t xml:space="preserve">This menu can be accessed from the System Tray icon and context menu on search string edit control in </w:t>
+      </w:r>
+      <w:proofErr w:type="spellStart"/>
+      <w:r>
+        <w:rPr>
+          <w:lang w:val="en-US"/>
+        </w:rPr>
+        <w:t>AltTab</w:t>
+      </w:r>
+      <w:proofErr w:type="spellEnd"/>
+      <w:r>
+        <w:rPr>
+          <w:lang w:val="en-US"/>
+        </w:rPr>
+        <w:t xml:space="preserve"> window as shown below.</w:t>
+      </w:r>
+    </w:p>
+    <w:p>
+      <w:pPr>
+        <w:rPr>
+          <w:lang w:val="en-US"/>
+        </w:rPr>
+      </w:pPr>
+      <w:r>
+        <w:rPr>
+          <w:noProof/>
+        </w:rPr>
+        <w:lastRenderedPageBreak/>
+        <w:drawing>
+          <wp:inline distT="0" distB="0" distL="0" distR="0" wp14:anchorId="453B92B0" wp14:editId="4A128F61">
+            <wp:extent cx="6858000" cy="2955925"/>
+            <wp:effectExtent l="0" t="0" r="0" b="0"/>
+            <wp:docPr id="139382893" name="Picture 1" descr="A screenshot of a computer&#10;&#10;AI-generated content may be incorrect."/>
+            <wp:cNvGraphicFramePr>
+              <a:graphicFrameLocks xmlns:a="http://schemas.openxmlformats.org/drawingml/2006/main" noChangeAspect="1"/>
+            </wp:cNvGraphicFramePr>
+            <a:graphic xmlns:a="http://schemas.openxmlformats.org/drawingml/2006/main">
+              <a:graphicData uri="http://schemas.openxmlformats.org/drawingml/2006/picture">
+                <pic:pic xmlns:pic="http://schemas.openxmlformats.org/drawingml/2006/picture">
+                  <pic:nvPicPr>
+                    <pic:cNvPr id="139382893" name="Picture 1" descr="A screenshot of a computer&#10;&#10;AI-generated content may be incorrect."/>
+                    <pic:cNvPicPr/>
+                  </pic:nvPicPr>
+                  <pic:blipFill>
+                    <a:blip r:embed="rId12"/>
+                    <a:stretch>
+                      <a:fillRect/>
+                    </a:stretch>
+                  </pic:blipFill>
+                  <pic:spPr>
+                    <a:xfrm>
+                      <a:off x="0" y="0"/>
+                      <a:ext cx="6858000" cy="2955925"/>
+                    </a:xfrm>
+                    <a:prstGeom prst="rect">
+                      <a:avLst/>
+                    </a:prstGeom>
+                  </pic:spPr>
+                </pic:pic>
+              </a:graphicData>
+            </a:graphic>
+          </wp:inline>
+        </w:drawing>
+      </w:r>
+    </w:p>
     <w:tbl>
       <w:tblPr>
         <w:tblStyle w:val="GridTable4-Accent3"/>
@@ -2035,7 +2132,6 @@
               <w:pStyle w:val="NoSpacing"/>
             </w:pPr>
             <w:r>
-              <w:lastRenderedPageBreak/>
               <w:t>Release Notes</w:t>
             </w:r>
           </w:p>
@@ -2632,7 +2728,7 @@
                     <pic:cNvPicPr/>
                   </pic:nvPicPr>
                   <pic:blipFill>
-                    <a:blip r:embed="rId12"/>
+                    <a:blip r:embed="rId13"/>
                     <a:stretch>
                       <a:fillRect/>
                     </a:stretch>
@@ -2729,6 +2825,7 @@
         <w:rPr>
           <w:noProof/>
         </w:rPr>
+        <w:lastRenderedPageBreak/>
         <w:drawing>
           <wp:inline distT="0" distB="0" distL="0" distR="0" wp14:anchorId="405BF6C8" wp14:editId="14DF347A">
             <wp:extent cx="2343150" cy="3124200"/>
@@ -2808,7 +2905,6 @@
         <w:rPr>
           <w:noProof/>
         </w:rPr>
-        <w:lastRenderedPageBreak/>
         <w:drawing>
           <wp:inline distT="0" distB="0" distL="0" distR="0" wp14:anchorId="43467F07" wp14:editId="02840D22">
             <wp:extent cx="6019048" cy="4571429"/>
@@ -2825,7 +2921,7 @@
                     <pic:cNvPicPr/>
                   </pic:nvPicPr>
                   <pic:blipFill>
-                    <a:blip r:embed="rId13"/>
+                    <a:blip r:embed="rId14"/>
                     <a:stretch>
                       <a:fillRect/>
                     </a:stretch>
@@ -2915,6 +3011,7 @@
         <w:rPr>
           <w:noProof/>
         </w:rPr>
+        <w:lastRenderedPageBreak/>
         <w:drawing>
           <wp:inline distT="0" distB="0" distL="0" distR="0" wp14:anchorId="65924BCF" wp14:editId="05816DE0">
             <wp:extent cx="2180952" cy="2828571"/>
@@ -2931,7 +3028,7 @@
                     <pic:cNvPicPr/>
                   </pic:nvPicPr>
                   <pic:blipFill>
-                    <a:blip r:embed="rId14"/>
+                    <a:blip r:embed="rId15"/>
                     <a:stretch>
                       <a:fillRect/>
                     </a:stretch>
@@ -3027,7 +3124,7 @@
                     <pic:cNvPicPr/>
                   </pic:nvPicPr>
                   <pic:blipFill>
-                    <a:blip r:embed="rId15"/>
+                    <a:blip r:embed="rId16"/>
                     <a:stretch>
                       <a:fillRect/>
                     </a:stretch>
@@ -3066,7 +3163,7 @@
         <w:tc>
           <w:tcPr>
             <w:cnfStyle w:val="001000000000" w:firstRow="0" w:lastRow="0" w:firstColumn="1" w:lastColumn="0" w:oddVBand="0" w:evenVBand="0" w:oddHBand="0" w:evenHBand="0" w:firstRowFirstColumn="0" w:firstRowLastColumn="0" w:lastRowFirstColumn="0" w:lastRowLastColumn="0"/>
-            <w:tcW w:w="2830" w:type="dxa"/>
+            <w:tcW w:w="2392" w:type="dxa"/>
             <w:hideMark/>
           </w:tcPr>
           <w:p>
@@ -3080,7 +3177,7 @@
         </w:tc>
         <w:tc>
           <w:tcPr>
-            <w:tcW w:w="7938" w:type="dxa"/>
+            <w:tcW w:w="8398" w:type="dxa"/>
             <w:hideMark/>
           </w:tcPr>
           <w:p>
@@ -3101,7 +3198,7 @@
         <w:tc>
           <w:tcPr>
             <w:cnfStyle w:val="001000000000" w:firstRow="0" w:lastRow="0" w:firstColumn="1" w:lastColumn="0" w:oddVBand="0" w:evenVBand="0" w:oddHBand="0" w:evenHBand="0" w:firstRowFirstColumn="0" w:firstRowLastColumn="0" w:lastRowFirstColumn="0" w:lastRowLastColumn="0"/>
-            <w:tcW w:w="2830" w:type="dxa"/>
+            <w:tcW w:w="2392" w:type="dxa"/>
             <w:tcBorders>
               <w:top w:val="single" w:sz="4" w:space="0" w:color="C9C9C9" w:themeColor="accent3" w:themeTint="99"/>
               <w:left w:val="single" w:sz="4" w:space="0" w:color="C9C9C9" w:themeColor="accent3" w:themeTint="99"/>
@@ -3121,7 +3218,7 @@
         </w:tc>
         <w:tc>
           <w:tcPr>
-            <w:tcW w:w="7938" w:type="dxa"/>
+            <w:tcW w:w="8398" w:type="dxa"/>
             <w:tcBorders>
               <w:top w:val="single" w:sz="4" w:space="0" w:color="C9C9C9" w:themeColor="accent3" w:themeTint="99"/>
               <w:left w:val="single" w:sz="4" w:space="0" w:color="C9C9C9" w:themeColor="accent3" w:themeTint="99"/>
@@ -3141,7 +3238,13 @@
             </w:r>
             <w:proofErr w:type="spellEnd"/>
             <w:r>
-              <w:t xml:space="preserve"> settings file path.</w:t>
+              <w:t xml:space="preserve"> settings </w:t>
+            </w:r>
+            <w:r>
+              <w:t xml:space="preserve">INI </w:t>
+            </w:r>
+            <w:r>
+              <w:t>file path.</w:t>
             </w:r>
           </w:p>
         </w:tc>
@@ -3150,34 +3253,124 @@
         <w:tc>
           <w:tcPr>
             <w:cnfStyle w:val="001000000000" w:firstRow="0" w:lastRow="0" w:firstColumn="1" w:lastColumn="0" w:oddVBand="0" w:evenVBand="0" w:oddHBand="0" w:evenHBand="0" w:firstRowFirstColumn="0" w:firstRowLastColumn="0" w:lastRowFirstColumn="0" w:lastRowLastColumn="0"/>
-            <w:tcW w:w="2830" w:type="dxa"/>
-            <w:tcBorders>
-              <w:top w:val="single" w:sz="4" w:space="0" w:color="C9C9C9" w:themeColor="accent3" w:themeTint="99"/>
-              <w:left w:val="single" w:sz="4" w:space="0" w:color="C9C9C9" w:themeColor="accent3" w:themeTint="99"/>
-              <w:bottom w:val="single" w:sz="4" w:space="0" w:color="C9C9C9" w:themeColor="accent3" w:themeTint="99"/>
-              <w:right w:val="single" w:sz="4" w:space="0" w:color="C9C9C9" w:themeColor="accent3" w:themeTint="99"/>
-            </w:tcBorders>
-            <w:hideMark/>
+            <w:tcW w:w="10790" w:type="dxa"/>
+            <w:gridSpan w:val="2"/>
+            <w:tcBorders>
+              <w:top w:val="single" w:sz="4" w:space="0" w:color="C9C9C9" w:themeColor="accent3" w:themeTint="99"/>
+              <w:left w:val="single" w:sz="4" w:space="0" w:color="C9C9C9" w:themeColor="accent3" w:themeTint="99"/>
+              <w:bottom w:val="single" w:sz="4" w:space="0" w:color="C9C9C9" w:themeColor="accent3" w:themeTint="99"/>
+              <w:right w:val="single" w:sz="4" w:space="0" w:color="C9C9C9" w:themeColor="accent3" w:themeTint="99"/>
+            </w:tcBorders>
+            <w:shd w:val="clear" w:color="auto" w:fill="BDD6EE" w:themeFill="accent1" w:themeFillTint="66"/>
           </w:tcPr>
           <w:p>
             <w:pPr>
               <w:spacing w:after="0" w:line="240" w:lineRule="auto"/>
-            </w:pPr>
-            <w:r>
-              <w:t>Fuzzy string match percent</w:t>
-            </w:r>
-          </w:p>
-        </w:tc>
-        <w:tc>
-          <w:tcPr>
-            <w:tcW w:w="7938" w:type="dxa"/>
-            <w:tcBorders>
-              <w:top w:val="single" w:sz="4" w:space="0" w:color="C9C9C9" w:themeColor="accent3" w:themeTint="99"/>
-              <w:left w:val="single" w:sz="4" w:space="0" w:color="C9C9C9" w:themeColor="accent3" w:themeTint="99"/>
-              <w:bottom w:val="single" w:sz="4" w:space="0" w:color="C9C9C9" w:themeColor="accent3" w:themeTint="99"/>
-              <w:right w:val="single" w:sz="4" w:space="0" w:color="C9C9C9" w:themeColor="accent3" w:themeTint="99"/>
-            </w:tcBorders>
-            <w:hideMark/>
+              <w:jc w:val="center"/>
+              <w:rPr>
+                <w:color w:val="002060"/>
+              </w:rPr>
+            </w:pPr>
+            <w:r>
+              <w:rPr>
+                <w:color w:val="002060"/>
+              </w:rPr>
+              <w:t>Hotkeys Group</w:t>
+            </w:r>
+          </w:p>
+        </w:tc>
+      </w:tr>
+      <w:tr>
+        <w:trPr>
+          <w:cnfStyle w:val="000000100000" w:firstRow="0" w:lastRow="0" w:firstColumn="0" w:lastColumn="0" w:oddVBand="0" w:evenVBand="0" w:oddHBand="1" w:evenHBand="0" w:firstRowFirstColumn="0" w:firstRowLastColumn="0" w:lastRowFirstColumn="0" w:lastRowLastColumn="0"/>
+        </w:trPr>
+        <w:tc>
+          <w:tcPr>
+            <w:cnfStyle w:val="001000000000" w:firstRow="0" w:lastRow="0" w:firstColumn="1" w:lastColumn="0" w:oddVBand="0" w:evenVBand="0" w:oddHBand="0" w:evenHBand="0" w:firstRowFirstColumn="0" w:firstRowLastColumn="0" w:lastRowFirstColumn="0" w:lastRowLastColumn="0"/>
+            <w:tcW w:w="2392" w:type="dxa"/>
+            <w:tcBorders>
+              <w:top w:val="single" w:sz="4" w:space="0" w:color="C9C9C9" w:themeColor="accent3" w:themeTint="99"/>
+              <w:left w:val="single" w:sz="4" w:space="0" w:color="C9C9C9" w:themeColor="accent3" w:themeTint="99"/>
+              <w:bottom w:val="single" w:sz="4" w:space="0" w:color="C9C9C9" w:themeColor="accent3" w:themeTint="99"/>
+              <w:right w:val="single" w:sz="4" w:space="0" w:color="C9C9C9" w:themeColor="accent3" w:themeTint="99"/>
+            </w:tcBorders>
+          </w:tcPr>
+          <w:p>
+            <w:pPr>
+              <w:spacing w:after="0" w:line="240" w:lineRule="auto"/>
+            </w:pPr>
+            <w:proofErr w:type="spellStart"/>
+            <w:r>
+              <w:t>Alt+Tab</w:t>
+            </w:r>
+            <w:proofErr w:type="spellEnd"/>
+          </w:p>
+        </w:tc>
+        <w:tc>
+          <w:tcPr>
+            <w:tcW w:w="8398" w:type="dxa"/>
+            <w:tcBorders>
+              <w:top w:val="single" w:sz="4" w:space="0" w:color="C9C9C9" w:themeColor="accent3" w:themeTint="99"/>
+              <w:left w:val="single" w:sz="4" w:space="0" w:color="C9C9C9" w:themeColor="accent3" w:themeTint="99"/>
+              <w:bottom w:val="single" w:sz="4" w:space="0" w:color="C9C9C9" w:themeColor="accent3" w:themeTint="99"/>
+              <w:right w:val="single" w:sz="4" w:space="0" w:color="C9C9C9" w:themeColor="accent3" w:themeTint="99"/>
+            </w:tcBorders>
+          </w:tcPr>
+          <w:p>
+            <w:pPr>
+              <w:spacing w:after="0" w:line="240" w:lineRule="auto"/>
+              <w:cnfStyle w:val="000000100000" w:firstRow="0" w:lastRow="0" w:firstColumn="0" w:lastColumn="0" w:oddVBand="0" w:evenVBand="0" w:oddHBand="1" w:evenHBand="0" w:firstRowFirstColumn="0" w:firstRowLastColumn="0" w:lastRowFirstColumn="0" w:lastRowLastColumn="0"/>
+            </w:pPr>
+            <w:r>
+              <w:t xml:space="preserve">Enable or disable </w:t>
+            </w:r>
+            <w:proofErr w:type="spellStart"/>
+            <w:r>
+              <w:rPr>
+                <w:b/>
+                <w:bCs/>
+              </w:rPr>
+              <w:t>Alt+Tab</w:t>
+            </w:r>
+            <w:proofErr w:type="spellEnd"/>
+            <w:r>
+              <w:t xml:space="preserve"> hotkey</w:t>
+            </w:r>
+          </w:p>
+        </w:tc>
+      </w:tr>
+      <w:tr>
+        <w:tc>
+          <w:tcPr>
+            <w:cnfStyle w:val="001000000000" w:firstRow="0" w:lastRow="0" w:firstColumn="1" w:lastColumn="0" w:oddVBand="0" w:evenVBand="0" w:oddHBand="0" w:evenHBand="0" w:firstRowFirstColumn="0" w:firstRowLastColumn="0" w:lastRowFirstColumn="0" w:lastRowLastColumn="0"/>
+            <w:tcW w:w="2392" w:type="dxa"/>
+            <w:tcBorders>
+              <w:top w:val="single" w:sz="4" w:space="0" w:color="C9C9C9" w:themeColor="accent3" w:themeTint="99"/>
+              <w:left w:val="single" w:sz="4" w:space="0" w:color="C9C9C9" w:themeColor="accent3" w:themeTint="99"/>
+              <w:bottom w:val="single" w:sz="4" w:space="0" w:color="C9C9C9" w:themeColor="accent3" w:themeTint="99"/>
+              <w:right w:val="single" w:sz="4" w:space="0" w:color="C9C9C9" w:themeColor="accent3" w:themeTint="99"/>
+            </w:tcBorders>
+          </w:tcPr>
+          <w:p>
+            <w:pPr>
+              <w:spacing w:after="0" w:line="240" w:lineRule="auto"/>
+            </w:pPr>
+            <w:proofErr w:type="spellStart"/>
+            <w:r>
+              <w:t>Alt+Backtick</w:t>
+            </w:r>
+            <w:proofErr w:type="spellEnd"/>
+          </w:p>
+        </w:tc>
+        <w:tc>
+          <w:tcPr>
+            <w:tcW w:w="8398" w:type="dxa"/>
+            <w:tcBorders>
+              <w:top w:val="single" w:sz="4" w:space="0" w:color="C9C9C9" w:themeColor="accent3" w:themeTint="99"/>
+              <w:left w:val="single" w:sz="4" w:space="0" w:color="C9C9C9" w:themeColor="accent3" w:themeTint="99"/>
+              <w:bottom w:val="single" w:sz="4" w:space="0" w:color="C9C9C9" w:themeColor="accent3" w:themeTint="99"/>
+              <w:right w:val="single" w:sz="4" w:space="0" w:color="C9C9C9" w:themeColor="accent3" w:themeTint="99"/>
+            </w:tcBorders>
           </w:tcPr>
           <w:p>
             <w:pPr>
@@ -3185,13 +3378,172 @@
               <w:cnfStyle w:val="000000000000" w:firstRow="0" w:lastRow="0" w:firstColumn="0" w:lastColumn="0" w:oddVBand="0" w:evenVBand="0" w:oddHBand="0" w:evenHBand="0" w:firstRowFirstColumn="0" w:firstRowLastColumn="0" w:lastRowFirstColumn="0" w:lastRowLastColumn="0"/>
             </w:pPr>
             <w:r>
+              <w:t xml:space="preserve">Enable or disable </w:t>
+            </w:r>
+            <w:proofErr w:type="spellStart"/>
+            <w:r>
+              <w:rPr>
+                <w:b/>
+                <w:bCs/>
+              </w:rPr>
+              <w:t>Alt+Backtick</w:t>
+            </w:r>
+            <w:proofErr w:type="spellEnd"/>
+            <w:r>
+              <w:t xml:space="preserve"> hotkey</w:t>
+            </w:r>
+          </w:p>
+        </w:tc>
+      </w:tr>
+      <w:tr>
+        <w:trPr>
+          <w:cnfStyle w:val="000000100000" w:firstRow="0" w:lastRow="0" w:firstColumn="0" w:lastColumn="0" w:oddVBand="0" w:evenVBand="0" w:oddHBand="1" w:evenHBand="0" w:firstRowFirstColumn="0" w:firstRowLastColumn="0" w:lastRowFirstColumn="0" w:lastRowLastColumn="0"/>
+        </w:trPr>
+        <w:tc>
+          <w:tcPr>
+            <w:cnfStyle w:val="001000000000" w:firstRow="0" w:lastRow="0" w:firstColumn="1" w:lastColumn="0" w:oddVBand="0" w:evenVBand="0" w:oddHBand="0" w:evenHBand="0" w:firstRowFirstColumn="0" w:firstRowLastColumn="0" w:lastRowFirstColumn="0" w:lastRowLastColumn="0"/>
+            <w:tcW w:w="2392" w:type="dxa"/>
+            <w:tcBorders>
+              <w:top w:val="single" w:sz="4" w:space="0" w:color="C9C9C9" w:themeColor="accent3" w:themeTint="99"/>
+              <w:left w:val="single" w:sz="4" w:space="0" w:color="C9C9C9" w:themeColor="accent3" w:themeTint="99"/>
+              <w:bottom w:val="single" w:sz="4" w:space="0" w:color="C9C9C9" w:themeColor="accent3" w:themeTint="99"/>
+              <w:right w:val="single" w:sz="4" w:space="0" w:color="C9C9C9" w:themeColor="accent3" w:themeTint="99"/>
+            </w:tcBorders>
+          </w:tcPr>
+          <w:p>
+            <w:pPr>
+              <w:spacing w:after="0" w:line="240" w:lineRule="auto"/>
+            </w:pPr>
+            <w:proofErr w:type="spellStart"/>
+            <w:r>
+              <w:t>Alt+Ctrl+Tab</w:t>
+            </w:r>
+            <w:proofErr w:type="spellEnd"/>
+          </w:p>
+        </w:tc>
+        <w:tc>
+          <w:tcPr>
+            <w:tcW w:w="8398" w:type="dxa"/>
+            <w:tcBorders>
+              <w:top w:val="single" w:sz="4" w:space="0" w:color="C9C9C9" w:themeColor="accent3" w:themeTint="99"/>
+              <w:left w:val="single" w:sz="4" w:space="0" w:color="C9C9C9" w:themeColor="accent3" w:themeTint="99"/>
+              <w:bottom w:val="single" w:sz="4" w:space="0" w:color="C9C9C9" w:themeColor="accent3" w:themeTint="99"/>
+              <w:right w:val="single" w:sz="4" w:space="0" w:color="C9C9C9" w:themeColor="accent3" w:themeTint="99"/>
+            </w:tcBorders>
+          </w:tcPr>
+          <w:p>
+            <w:pPr>
+              <w:spacing w:after="0" w:line="240" w:lineRule="auto"/>
+              <w:cnfStyle w:val="000000100000" w:firstRow="0" w:lastRow="0" w:firstColumn="0" w:lastColumn="0" w:oddVBand="0" w:evenVBand="0" w:oddHBand="1" w:evenHBand="0" w:firstRowFirstColumn="0" w:firstRowLastColumn="0" w:lastRowFirstColumn="0" w:lastRowLastColumn="0"/>
+            </w:pPr>
+            <w:r>
+              <w:t xml:space="preserve">Enable/disable </w:t>
+            </w:r>
+            <w:proofErr w:type="spellStart"/>
+            <w:r>
+              <w:rPr>
+                <w:b/>
+                <w:bCs/>
+              </w:rPr>
+              <w:t>Alt+Ctrl+Tab</w:t>
+            </w:r>
+            <w:proofErr w:type="spellEnd"/>
+            <w:r>
+              <w:t xml:space="preserve"> hotkey, which displays </w:t>
+            </w:r>
+            <w:proofErr w:type="spellStart"/>
+            <w:r>
+              <w:t>AltTab</w:t>
+            </w:r>
+            <w:proofErr w:type="spellEnd"/>
+            <w:r>
+              <w:t xml:space="preserve"> window and remains open even Alt key is released</w:t>
+            </w:r>
+          </w:p>
+        </w:tc>
+      </w:tr>
+      <w:tr>
+        <w:tc>
+          <w:tcPr>
+            <w:cnfStyle w:val="001000000000" w:firstRow="0" w:lastRow="0" w:firstColumn="1" w:lastColumn="0" w:oddVBand="0" w:evenVBand="0" w:oddHBand="0" w:evenHBand="0" w:firstRowFirstColumn="0" w:firstRowLastColumn="0" w:lastRowFirstColumn="0" w:lastRowLastColumn="0"/>
+            <w:tcW w:w="10790" w:type="dxa"/>
+            <w:gridSpan w:val="2"/>
+            <w:tcBorders>
+              <w:top w:val="single" w:sz="4" w:space="0" w:color="C9C9C9" w:themeColor="accent3" w:themeTint="99"/>
+              <w:left w:val="single" w:sz="4" w:space="0" w:color="C9C9C9" w:themeColor="accent3" w:themeTint="99"/>
+              <w:bottom w:val="single" w:sz="4" w:space="0" w:color="C9C9C9" w:themeColor="accent3" w:themeTint="99"/>
+              <w:right w:val="single" w:sz="4" w:space="0" w:color="C9C9C9" w:themeColor="accent3" w:themeTint="99"/>
+            </w:tcBorders>
+            <w:shd w:val="clear" w:color="auto" w:fill="BDD6EE" w:themeFill="accent1" w:themeFillTint="66"/>
+          </w:tcPr>
+          <w:p>
+            <w:pPr>
+              <w:spacing w:after="0" w:line="240" w:lineRule="auto"/>
+              <w:jc w:val="center"/>
+              <w:rPr>
+                <w:color w:val="002060"/>
+              </w:rPr>
+            </w:pPr>
+            <w:bookmarkStart w:id="10" w:name="_Hlk218327961"/>
+            <w:r>
+              <w:rPr>
+                <w:color w:val="002060"/>
+              </w:rPr>
+              <w:t>General Group</w:t>
+            </w:r>
+          </w:p>
+        </w:tc>
+      </w:tr>
+      <w:bookmarkEnd w:id="10"/>
+      <w:tr>
+        <w:trPr>
+          <w:cnfStyle w:val="000000100000" w:firstRow="0" w:lastRow="0" w:firstColumn="0" w:lastColumn="0" w:oddVBand="0" w:evenVBand="0" w:oddHBand="1" w:evenHBand="0" w:firstRowFirstColumn="0" w:firstRowLastColumn="0" w:lastRowFirstColumn="0" w:lastRowLastColumn="0"/>
+        </w:trPr>
+        <w:tc>
+          <w:tcPr>
+            <w:cnfStyle w:val="001000000000" w:firstRow="0" w:lastRow="0" w:firstColumn="1" w:lastColumn="0" w:oddVBand="0" w:evenVBand="0" w:oddHBand="0" w:evenHBand="0" w:firstRowFirstColumn="0" w:firstRowLastColumn="0" w:lastRowFirstColumn="0" w:lastRowLastColumn="0"/>
+            <w:tcW w:w="2392" w:type="dxa"/>
+            <w:tcBorders>
+              <w:top w:val="single" w:sz="4" w:space="0" w:color="C9C9C9" w:themeColor="accent3" w:themeTint="99"/>
+              <w:left w:val="single" w:sz="4" w:space="0" w:color="C9C9C9" w:themeColor="accent3" w:themeTint="99"/>
+              <w:bottom w:val="single" w:sz="4" w:space="0" w:color="C9C9C9" w:themeColor="accent3" w:themeTint="99"/>
+              <w:right w:val="single" w:sz="4" w:space="0" w:color="C9C9C9" w:themeColor="accent3" w:themeTint="99"/>
+            </w:tcBorders>
+            <w:hideMark/>
+          </w:tcPr>
+          <w:p>
+            <w:pPr>
+              <w:spacing w:after="0" w:line="240" w:lineRule="auto"/>
+            </w:pPr>
+            <w:r>
+              <w:t>Fuzzy string match percent</w:t>
+            </w:r>
+          </w:p>
+        </w:tc>
+        <w:tc>
+          <w:tcPr>
+            <w:tcW w:w="8398" w:type="dxa"/>
+            <w:tcBorders>
+              <w:top w:val="single" w:sz="4" w:space="0" w:color="C9C9C9" w:themeColor="accent3" w:themeTint="99"/>
+              <w:left w:val="single" w:sz="4" w:space="0" w:color="C9C9C9" w:themeColor="accent3" w:themeTint="99"/>
+              <w:bottom w:val="single" w:sz="4" w:space="0" w:color="C9C9C9" w:themeColor="accent3" w:themeTint="99"/>
+              <w:right w:val="single" w:sz="4" w:space="0" w:color="C9C9C9" w:themeColor="accent3" w:themeTint="99"/>
+            </w:tcBorders>
+            <w:hideMark/>
+          </w:tcPr>
+          <w:p>
+            <w:pPr>
+              <w:spacing w:after="0" w:line="240" w:lineRule="auto"/>
+              <w:cnfStyle w:val="000000100000" w:firstRow="0" w:lastRow="0" w:firstColumn="0" w:lastColumn="0" w:oddVBand="0" w:evenVBand="0" w:oddHBand="1" w:evenHBand="0" w:firstRowFirstColumn="0" w:firstRowLastColumn="0" w:lastRowFirstColumn="0" w:lastRowLastColumn="0"/>
+            </w:pPr>
+            <w:r>
               <w:t>Fuzzy name match percent between search string and process name/title.</w:t>
             </w:r>
           </w:p>
           <w:p>
             <w:pPr>
               <w:spacing w:after="0" w:line="240" w:lineRule="auto"/>
-              <w:cnfStyle w:val="000000000000" w:firstRow="0" w:lastRow="0" w:firstColumn="0" w:lastColumn="0" w:oddVBand="0" w:evenVBand="0" w:oddHBand="0" w:evenHBand="0" w:firstRowFirstColumn="0" w:firstRowLastColumn="0" w:lastRowFirstColumn="0" w:lastRowLastColumn="0"/>
+              <w:cnfStyle w:val="000000100000" w:firstRow="0" w:lastRow="0" w:firstColumn="0" w:lastColumn="0" w:oddVBand="0" w:evenVBand="0" w:oddHBand="1" w:evenHBand="0" w:firstRowFirstColumn="0" w:firstRowLastColumn="0" w:lastRowFirstColumn="0" w:lastRowLastColumn="0"/>
             </w:pPr>
             <w:r>
               <w:t xml:space="preserve">    100 % means exact match (uses native string search algorithm)</w:t>
@@ -3200,7 +3552,7 @@
           <w:p>
             <w:pPr>
               <w:spacing w:after="0" w:line="240" w:lineRule="auto"/>
-              <w:cnfStyle w:val="000000000000" w:firstRow="0" w:lastRow="0" w:firstColumn="0" w:lastColumn="0" w:oddVBand="0" w:evenVBand="0" w:oddHBand="0" w:evenHBand="0" w:firstRowFirstColumn="0" w:firstRowLastColumn="0" w:lastRowFirstColumn="0" w:lastRowLastColumn="0"/>
+              <w:cnfStyle w:val="000000100000" w:firstRow="0" w:lastRow="0" w:firstColumn="0" w:lastColumn="0" w:oddVBand="0" w:evenVBand="0" w:oddHBand="1" w:evenHBand="0" w:firstRowFirstColumn="0" w:firstRowLastColumn="0" w:lastRowFirstColumn="0" w:lastRowLastColumn="0"/>
             </w:pPr>
             <w:r>
               <w:t xml:space="preserve">      80 % would cause "files" to match "</w:t>
@@ -3217,7 +3569,7 @@
           <w:p>
             <w:pPr>
               <w:spacing w:after="0" w:line="240" w:lineRule="auto"/>
-              <w:cnfStyle w:val="000000000000" w:firstRow="0" w:lastRow="0" w:firstColumn="0" w:lastColumn="0" w:oddVBand="0" w:evenVBand="0" w:oddHBand="0" w:evenHBand="0" w:firstRowFirstColumn="0" w:firstRowLastColumn="0" w:lastRowFirstColumn="0" w:lastRowLastColumn="0"/>
+              <w:cnfStyle w:val="000000100000" w:firstRow="0" w:lastRow="0" w:firstColumn="0" w:lastColumn="0" w:oddVBand="0" w:evenVBand="0" w:oddHBand="1" w:evenHBand="0" w:firstRowFirstColumn="0" w:firstRowLastColumn="0" w:lastRowFirstColumn="0" w:lastRowLastColumn="0"/>
             </w:pPr>
             <w:r>
               <w:rPr>
@@ -3225,7 +3577,7 @@
               </w:rPr>
               <w:t xml:space="preserve">Reference: </w:t>
             </w:r>
-            <w:hyperlink r:id="rId16" w:history="1">
+            <w:hyperlink r:id="rId17" w:history="1">
               <w:r>
                 <w:rPr>
                   <w:rStyle w:val="Hyperlink"/>
@@ -3236,7 +3588,7 @@
             <w:r>
               <w:t xml:space="preserve">, </w:t>
             </w:r>
-            <w:hyperlink r:id="rId17" w:history="1">
+            <w:hyperlink r:id="rId18" w:history="1">
               <w:proofErr w:type="spellStart"/>
               <w:r>
                 <w:rPr>
@@ -3256,7 +3608,7 @@
           <w:p>
             <w:pPr>
               <w:spacing w:after="0" w:line="240" w:lineRule="auto"/>
-              <w:cnfStyle w:val="000000000000" w:firstRow="0" w:lastRow="0" w:firstColumn="0" w:lastColumn="0" w:oddVBand="0" w:evenVBand="0" w:oddHBand="0" w:evenHBand="0" w:firstRowFirstColumn="0" w:firstRowLastColumn="0" w:lastRowFirstColumn="0" w:lastRowLastColumn="0"/>
+              <w:cnfStyle w:val="000000100000" w:firstRow="0" w:lastRow="0" w:firstColumn="0" w:lastColumn="0" w:oddVBand="0" w:evenVBand="0" w:oddHBand="1" w:evenHBand="0" w:firstRowFirstColumn="0" w:firstRowLastColumn="0" w:lastRowFirstColumn="0" w:lastRowLastColumn="0"/>
               <w:rPr>
                 <w:color w:val="FF0000"/>
               </w:rPr>
@@ -3278,7 +3630,7 @@
           <w:p>
             <w:pPr>
               <w:pStyle w:val="NoSpacing"/>
-              <w:cnfStyle w:val="000000000000" w:firstRow="0" w:lastRow="0" w:firstColumn="0" w:lastColumn="0" w:oddVBand="0" w:evenVBand="0" w:oddHBand="0" w:evenHBand="0" w:firstRowFirstColumn="0" w:firstRowLastColumn="0" w:lastRowFirstColumn="0" w:lastRowLastColumn="0"/>
+              <w:cnfStyle w:val="000000100000" w:firstRow="0" w:lastRow="0" w:firstColumn="0" w:lastColumn="0" w:oddVBand="0" w:evenVBand="0" w:oddHBand="1" w:evenHBand="0" w:firstRowFirstColumn="0" w:firstRowLastColumn="0" w:lastRowFirstColumn="0" w:lastRowLastColumn="0"/>
             </w:pPr>
             <w:r>
               <w:t xml:space="preserve">If </w:t>
@@ -3297,6 +3649,69 @@
             </w:r>
             <w:r>
               <w:t xml:space="preserve"> to native string search.</w:t>
+            </w:r>
+          </w:p>
+        </w:tc>
+      </w:tr>
+      <w:tr>
+        <w:tc>
+          <w:tcPr>
+            <w:cnfStyle w:val="001000000000" w:firstRow="0" w:lastRow="0" w:firstColumn="1" w:lastColumn="0" w:oddVBand="0" w:evenVBand="0" w:oddHBand="0" w:evenHBand="0" w:firstRowFirstColumn="0" w:firstRowLastColumn="0" w:lastRowFirstColumn="0" w:lastRowLastColumn="0"/>
+            <w:tcW w:w="2392" w:type="dxa"/>
+            <w:tcBorders>
+              <w:top w:val="single" w:sz="4" w:space="0" w:color="C9C9C9" w:themeColor="accent3" w:themeTint="99"/>
+              <w:left w:val="single" w:sz="4" w:space="0" w:color="C9C9C9" w:themeColor="accent3" w:themeTint="99"/>
+              <w:bottom w:val="single" w:sz="4" w:space="0" w:color="C9C9C9" w:themeColor="accent3" w:themeTint="99"/>
+              <w:right w:val="single" w:sz="4" w:space="0" w:color="C9C9C9" w:themeColor="accent3" w:themeTint="99"/>
+            </w:tcBorders>
+            <w:hideMark/>
+          </w:tcPr>
+          <w:p>
+            <w:pPr>
+              <w:spacing w:after="0" w:line="240" w:lineRule="auto"/>
+            </w:pPr>
+            <w:r>
+              <w:lastRenderedPageBreak/>
+              <w:t>Window Transparency</w:t>
+            </w:r>
+          </w:p>
+        </w:tc>
+        <w:tc>
+          <w:tcPr>
+            <w:tcW w:w="8398" w:type="dxa"/>
+            <w:tcBorders>
+              <w:top w:val="single" w:sz="4" w:space="0" w:color="C9C9C9" w:themeColor="accent3" w:themeTint="99"/>
+              <w:left w:val="single" w:sz="4" w:space="0" w:color="C9C9C9" w:themeColor="accent3" w:themeTint="99"/>
+              <w:bottom w:val="single" w:sz="4" w:space="0" w:color="C9C9C9" w:themeColor="accent3" w:themeTint="99"/>
+              <w:right w:val="single" w:sz="4" w:space="0" w:color="C9C9C9" w:themeColor="accent3" w:themeTint="99"/>
+            </w:tcBorders>
+            <w:hideMark/>
+          </w:tcPr>
+          <w:p>
+            <w:pPr>
+              <w:spacing w:after="0" w:line="240" w:lineRule="auto"/>
+              <w:cnfStyle w:val="000000000000" w:firstRow="0" w:lastRow="0" w:firstColumn="0" w:lastColumn="0" w:oddVBand="0" w:evenVBand="0" w:oddHBand="0" w:evenHBand="0" w:firstRowFirstColumn="0" w:firstRowLastColumn="0" w:lastRowFirstColumn="0" w:lastRowLastColumn="0"/>
+            </w:pPr>
+            <w:r>
+              <w:t>Indicate the degree of transparency.</w:t>
+            </w:r>
+          </w:p>
+          <w:p>
+            <w:pPr>
+              <w:spacing w:after="0" w:line="240" w:lineRule="auto"/>
+              <w:cnfStyle w:val="000000000000" w:firstRow="0" w:lastRow="0" w:firstColumn="0" w:lastColumn="0" w:oddVBand="0" w:evenVBand="0" w:oddHBand="0" w:evenHBand="0" w:firstRowFirstColumn="0" w:firstRowLastColumn="0" w:lastRowFirstColumn="0" w:lastRowLastColumn="0"/>
+            </w:pPr>
+            <w:r>
+              <w:t xml:space="preserve">    0 – makes the window invisible</w:t>
+            </w:r>
+          </w:p>
+          <w:p>
+            <w:pPr>
+              <w:spacing w:after="0" w:line="240" w:lineRule="auto"/>
+              <w:cnfStyle w:val="000000000000" w:firstRow="0" w:lastRow="0" w:firstColumn="0" w:lastColumn="0" w:oddVBand="0" w:evenVBand="0" w:oddHBand="0" w:evenHBand="0" w:firstRowFirstColumn="0" w:firstRowLastColumn="0" w:lastRowFirstColumn="0" w:lastRowLastColumn="0"/>
+            </w:pPr>
+            <w:r>
+              <w:t>255 – makes it opaque</w:t>
             </w:r>
           </w:p>
         </w:tc>
@@ -3308,7 +3723,7 @@
         <w:tc>
           <w:tcPr>
             <w:cnfStyle w:val="001000000000" w:firstRow="0" w:lastRow="0" w:firstColumn="1" w:lastColumn="0" w:oddVBand="0" w:evenVBand="0" w:oddHBand="0" w:evenHBand="0" w:firstRowFirstColumn="0" w:firstRowLastColumn="0" w:lastRowFirstColumn="0" w:lastRowLastColumn="0"/>
-            <w:tcW w:w="2830" w:type="dxa"/>
+            <w:tcW w:w="2392" w:type="dxa"/>
             <w:tcBorders>
               <w:top w:val="single" w:sz="4" w:space="0" w:color="C9C9C9" w:themeColor="accent3" w:themeTint="99"/>
               <w:left w:val="single" w:sz="4" w:space="0" w:color="C9C9C9" w:themeColor="accent3" w:themeTint="99"/>
@@ -3322,13 +3737,13 @@
               <w:spacing w:after="0" w:line="240" w:lineRule="auto"/>
             </w:pPr>
             <w:r>
-              <w:t>Window Transparency</w:t>
-            </w:r>
-          </w:p>
-        </w:tc>
-        <w:tc>
-          <w:tcPr>
-            <w:tcW w:w="7938" w:type="dxa"/>
+              <w:t>Window Width (%)</w:t>
+            </w:r>
+          </w:p>
+        </w:tc>
+        <w:tc>
+          <w:tcPr>
+            <w:tcW w:w="8398" w:type="dxa"/>
             <w:tcBorders>
               <w:top w:val="single" w:sz="4" w:space="0" w:color="C9C9C9" w:themeColor="accent3" w:themeTint="99"/>
               <w:left w:val="single" w:sz="4" w:space="0" w:color="C9C9C9" w:themeColor="accent3" w:themeTint="99"/>
@@ -3343,25 +3758,7 @@
               <w:cnfStyle w:val="000000100000" w:firstRow="0" w:lastRow="0" w:firstColumn="0" w:lastColumn="0" w:oddVBand="0" w:evenVBand="0" w:oddHBand="1" w:evenHBand="0" w:firstRowFirstColumn="0" w:firstRowLastColumn="0" w:lastRowFirstColumn="0" w:lastRowLastColumn="0"/>
             </w:pPr>
             <w:r>
-              <w:t>Indicate the degree of transparency.</w:t>
-            </w:r>
-          </w:p>
-          <w:p>
-            <w:pPr>
-              <w:spacing w:after="0" w:line="240" w:lineRule="auto"/>
-              <w:cnfStyle w:val="000000100000" w:firstRow="0" w:lastRow="0" w:firstColumn="0" w:lastColumn="0" w:oddVBand="0" w:evenVBand="0" w:oddHBand="1" w:evenHBand="0" w:firstRowFirstColumn="0" w:firstRowLastColumn="0" w:lastRowFirstColumn="0" w:lastRowLastColumn="0"/>
-            </w:pPr>
-            <w:r>
-              <w:t xml:space="preserve">    0 – makes the window invisible</w:t>
-            </w:r>
-          </w:p>
-          <w:p>
-            <w:pPr>
-              <w:spacing w:after="0" w:line="240" w:lineRule="auto"/>
-              <w:cnfStyle w:val="000000100000" w:firstRow="0" w:lastRow="0" w:firstColumn="0" w:lastColumn="0" w:oddVBand="0" w:evenVBand="0" w:oddHBand="1" w:evenHBand="0" w:firstRowFirstColumn="0" w:firstRowLastColumn="0" w:lastRowFirstColumn="0" w:lastRowLastColumn="0"/>
-            </w:pPr>
-            <w:r>
-              <w:t>255 – makes it opaque</w:t>
+              <w:t>Main window width w.r.t percentage of screen width.</w:t>
             </w:r>
           </w:p>
         </w:tc>
@@ -3370,7 +3767,7 @@
         <w:tc>
           <w:tcPr>
             <w:cnfStyle w:val="001000000000" w:firstRow="0" w:lastRow="0" w:firstColumn="1" w:lastColumn="0" w:oddVBand="0" w:evenVBand="0" w:oddHBand="0" w:evenHBand="0" w:firstRowFirstColumn="0" w:firstRowLastColumn="0" w:lastRowFirstColumn="0" w:lastRowLastColumn="0"/>
-            <w:tcW w:w="2830" w:type="dxa"/>
+            <w:tcW w:w="2392" w:type="dxa"/>
             <w:tcBorders>
               <w:top w:val="single" w:sz="4" w:space="0" w:color="C9C9C9" w:themeColor="accent3" w:themeTint="99"/>
               <w:left w:val="single" w:sz="4" w:space="0" w:color="C9C9C9" w:themeColor="accent3" w:themeTint="99"/>
@@ -3384,13 +3781,13 @@
               <w:spacing w:after="0" w:line="240" w:lineRule="auto"/>
             </w:pPr>
             <w:r>
-              <w:t>Window Width (%)</w:t>
-            </w:r>
-          </w:p>
-        </w:tc>
-        <w:tc>
-          <w:tcPr>
-            <w:tcW w:w="7938" w:type="dxa"/>
+              <w:t>Window Height (%)</w:t>
+            </w:r>
+          </w:p>
+        </w:tc>
+        <w:tc>
+          <w:tcPr>
+            <w:tcW w:w="8398" w:type="dxa"/>
             <w:tcBorders>
               <w:top w:val="single" w:sz="4" w:space="0" w:color="C9C9C9" w:themeColor="accent3" w:themeTint="99"/>
               <w:left w:val="single" w:sz="4" w:space="0" w:color="C9C9C9" w:themeColor="accent3" w:themeTint="99"/>
@@ -3405,7 +3802,40 @@
               <w:cnfStyle w:val="000000000000" w:firstRow="0" w:lastRow="0" w:firstColumn="0" w:lastColumn="0" w:oddVBand="0" w:evenVBand="0" w:oddHBand="0" w:evenHBand="0" w:firstRowFirstColumn="0" w:firstRowLastColumn="0" w:lastRowFirstColumn="0" w:lastRowLastColumn="0"/>
             </w:pPr>
             <w:r>
-              <w:t>Main window width w.r.t percentage of screen width.</w:t>
+              <w:t>Main window maximum height w.r.t percentage of screen height.</w:t>
+            </w:r>
+          </w:p>
+          <w:p>
+            <w:pPr>
+              <w:spacing w:after="0" w:line="240" w:lineRule="auto"/>
+              <w:cnfStyle w:val="000000000000" w:firstRow="0" w:lastRow="0" w:firstColumn="0" w:lastColumn="0" w:oddVBand="0" w:evenVBand="0" w:oddHBand="0" w:evenHBand="0" w:firstRowFirstColumn="0" w:firstRowLastColumn="0" w:lastRowFirstColumn="0" w:lastRowLastColumn="0"/>
+            </w:pPr>
+            <w:r>
+              <w:t xml:space="preserve">If there are </w:t>
+            </w:r>
+            <w:proofErr w:type="gramStart"/>
+            <w:r>
+              <w:t>more</w:t>
+            </w:r>
+            <w:proofErr w:type="gramEnd"/>
+            <w:r>
+              <w:t xml:space="preserve"> number of processes which exceeds the </w:t>
+            </w:r>
+            <w:proofErr w:type="spellStart"/>
+            <w:r>
+              <w:t>WindowHeight</w:t>
+            </w:r>
+            <w:proofErr w:type="spellEnd"/>
+            <w:r>
+              <w:t xml:space="preserve"> to accommodate all the tasks, then resize the window to </w:t>
+            </w:r>
+            <w:proofErr w:type="spellStart"/>
+            <w:r>
+              <w:t>WindowHeight</w:t>
+            </w:r>
+            <w:proofErr w:type="spellEnd"/>
+            <w:r>
+              <w:t xml:space="preserve"> according scroll bar presence.</w:t>
             </w:r>
           </w:p>
         </w:tc>
@@ -3417,7 +3847,7 @@
         <w:tc>
           <w:tcPr>
             <w:cnfStyle w:val="001000000000" w:firstRow="0" w:lastRow="0" w:firstColumn="1" w:lastColumn="0" w:oddVBand="0" w:evenVBand="0" w:oddHBand="0" w:evenHBand="0" w:firstRowFirstColumn="0" w:firstRowLastColumn="0" w:lastRowFirstColumn="0" w:lastRowLastColumn="0"/>
-            <w:tcW w:w="2830" w:type="dxa"/>
+            <w:tcW w:w="2392" w:type="dxa"/>
             <w:tcBorders>
               <w:top w:val="single" w:sz="4" w:space="0" w:color="C9C9C9" w:themeColor="accent3" w:themeTint="99"/>
               <w:left w:val="single" w:sz="4" w:space="0" w:color="C9C9C9" w:themeColor="accent3" w:themeTint="99"/>
@@ -3431,13 +3861,13 @@
               <w:spacing w:after="0" w:line="240" w:lineRule="auto"/>
             </w:pPr>
             <w:r>
-              <w:t>Window Height (%)</w:t>
-            </w:r>
-          </w:p>
-        </w:tc>
-        <w:tc>
-          <w:tcPr>
-            <w:tcW w:w="7938" w:type="dxa"/>
+              <w:t>Check for Updates</w:t>
+            </w:r>
+          </w:p>
+        </w:tc>
+        <w:tc>
+          <w:tcPr>
+            <w:tcW w:w="8398" w:type="dxa"/>
             <w:tcBorders>
               <w:top w:val="single" w:sz="4" w:space="0" w:color="C9C9C9" w:themeColor="accent3" w:themeTint="99"/>
               <w:left w:val="single" w:sz="4" w:space="0" w:color="C9C9C9" w:themeColor="accent3" w:themeTint="99"/>
@@ -3452,92 +3882,13 @@
               <w:cnfStyle w:val="000000100000" w:firstRow="0" w:lastRow="0" w:firstColumn="0" w:lastColumn="0" w:oddVBand="0" w:evenVBand="0" w:oddHBand="1" w:evenHBand="0" w:firstRowFirstColumn="0" w:firstRowLastColumn="0" w:lastRowFirstColumn="0" w:lastRowLastColumn="0"/>
             </w:pPr>
             <w:r>
-              <w:t>Main window maximum height w.r.t percentage of screen height.</w:t>
+              <w:t>How frequently check for updates.</w:t>
             </w:r>
           </w:p>
           <w:p>
             <w:pPr>
               <w:spacing w:after="0" w:line="240" w:lineRule="auto"/>
               <w:cnfStyle w:val="000000100000" w:firstRow="0" w:lastRow="0" w:firstColumn="0" w:lastColumn="0" w:oddVBand="0" w:evenVBand="0" w:oddHBand="1" w:evenHBand="0" w:firstRowFirstColumn="0" w:firstRowLastColumn="0" w:lastRowFirstColumn="0" w:lastRowLastColumn="0"/>
-            </w:pPr>
-            <w:r>
-              <w:lastRenderedPageBreak/>
-              <w:t xml:space="preserve">If there are </w:t>
-            </w:r>
-            <w:proofErr w:type="gramStart"/>
-            <w:r>
-              <w:t>more</w:t>
-            </w:r>
-            <w:proofErr w:type="gramEnd"/>
-            <w:r>
-              <w:t xml:space="preserve"> number of processes which exceeds the </w:t>
-            </w:r>
-            <w:proofErr w:type="spellStart"/>
-            <w:r>
-              <w:t>WindowHeight</w:t>
-            </w:r>
-            <w:proofErr w:type="spellEnd"/>
-            <w:r>
-              <w:t xml:space="preserve"> to accommodate all the tasks, then resize the window to </w:t>
-            </w:r>
-            <w:proofErr w:type="spellStart"/>
-            <w:r>
-              <w:t>WindowHeight</w:t>
-            </w:r>
-            <w:proofErr w:type="spellEnd"/>
-            <w:r>
-              <w:t xml:space="preserve"> according scroll bar presence.</w:t>
-            </w:r>
-          </w:p>
-        </w:tc>
-      </w:tr>
-      <w:tr>
-        <w:tc>
-          <w:tcPr>
-            <w:cnfStyle w:val="001000000000" w:firstRow="0" w:lastRow="0" w:firstColumn="1" w:lastColumn="0" w:oddVBand="0" w:evenVBand="0" w:oddHBand="0" w:evenHBand="0" w:firstRowFirstColumn="0" w:firstRowLastColumn="0" w:lastRowFirstColumn="0" w:lastRowLastColumn="0"/>
-            <w:tcW w:w="2830" w:type="dxa"/>
-            <w:tcBorders>
-              <w:top w:val="single" w:sz="4" w:space="0" w:color="C9C9C9" w:themeColor="accent3" w:themeTint="99"/>
-              <w:left w:val="single" w:sz="4" w:space="0" w:color="C9C9C9" w:themeColor="accent3" w:themeTint="99"/>
-              <w:bottom w:val="single" w:sz="4" w:space="0" w:color="C9C9C9" w:themeColor="accent3" w:themeTint="99"/>
-              <w:right w:val="single" w:sz="4" w:space="0" w:color="C9C9C9" w:themeColor="accent3" w:themeTint="99"/>
-            </w:tcBorders>
-            <w:hideMark/>
-          </w:tcPr>
-          <w:p>
-            <w:pPr>
-              <w:spacing w:after="0" w:line="240" w:lineRule="auto"/>
-            </w:pPr>
-            <w:r>
-              <w:lastRenderedPageBreak/>
-              <w:t>Check for Updates</w:t>
-            </w:r>
-          </w:p>
-        </w:tc>
-        <w:tc>
-          <w:tcPr>
-            <w:tcW w:w="7938" w:type="dxa"/>
-            <w:tcBorders>
-              <w:top w:val="single" w:sz="4" w:space="0" w:color="C9C9C9" w:themeColor="accent3" w:themeTint="99"/>
-              <w:left w:val="single" w:sz="4" w:space="0" w:color="C9C9C9" w:themeColor="accent3" w:themeTint="99"/>
-              <w:bottom w:val="single" w:sz="4" w:space="0" w:color="C9C9C9" w:themeColor="accent3" w:themeTint="99"/>
-              <w:right w:val="single" w:sz="4" w:space="0" w:color="C9C9C9" w:themeColor="accent3" w:themeTint="99"/>
-            </w:tcBorders>
-            <w:hideMark/>
-          </w:tcPr>
-          <w:p>
-            <w:pPr>
-              <w:spacing w:after="0" w:line="240" w:lineRule="auto"/>
-              <w:cnfStyle w:val="000000000000" w:firstRow="0" w:lastRow="0" w:firstColumn="0" w:lastColumn="0" w:oddVBand="0" w:evenVBand="0" w:oddHBand="0" w:evenHBand="0" w:firstRowFirstColumn="0" w:firstRowLastColumn="0" w:lastRowFirstColumn="0" w:lastRowLastColumn="0"/>
-            </w:pPr>
-            <w:r>
-              <w:t>How frequently check for updates.</w:t>
-            </w:r>
-          </w:p>
-          <w:p>
-            <w:pPr>
-              <w:spacing w:after="0" w:line="240" w:lineRule="auto"/>
-              <w:cnfStyle w:val="000000000000" w:firstRow="0" w:lastRow="0" w:firstColumn="0" w:lastColumn="0" w:oddVBand="0" w:evenVBand="0" w:oddHBand="0" w:evenHBand="0" w:firstRowFirstColumn="0" w:firstRowLastColumn="0" w:lastRowFirstColumn="0" w:lastRowLastColumn="0"/>
             </w:pPr>
             <w:r>
               <w:rPr>
@@ -3729,8 +4080,52 @@
           <w:p>
             <w:pPr>
               <w:spacing w:after="0" w:line="240" w:lineRule="auto"/>
+              <w:cnfStyle w:val="000000100000" w:firstRow="0" w:lastRow="0" w:firstColumn="0" w:lastColumn="0" w:oddVBand="0" w:evenVBand="0" w:oddHBand="1" w:evenHBand="0" w:firstRowFirstColumn="0" w:firstRowLastColumn="0" w:lastRowFirstColumn="0" w:lastRowLastColumn="0"/>
+            </w:pPr>
+          </w:p>
+        </w:tc>
+      </w:tr>
+      <w:tr>
+        <w:tc>
+          <w:tcPr>
+            <w:cnfStyle w:val="001000000000" w:firstRow="0" w:lastRow="0" w:firstColumn="1" w:lastColumn="0" w:oddVBand="0" w:evenVBand="0" w:oddHBand="0" w:evenHBand="0" w:firstRowFirstColumn="0" w:firstRowLastColumn="0" w:lastRowFirstColumn="0" w:lastRowLastColumn="0"/>
+            <w:tcW w:w="2392" w:type="dxa"/>
+            <w:tcBorders>
+              <w:top w:val="single" w:sz="4" w:space="0" w:color="C9C9C9" w:themeColor="accent3" w:themeTint="99"/>
+              <w:left w:val="single" w:sz="4" w:space="0" w:color="C9C9C9" w:themeColor="accent3" w:themeTint="99"/>
+              <w:bottom w:val="single" w:sz="4" w:space="0" w:color="C9C9C9" w:themeColor="accent3" w:themeTint="99"/>
+              <w:right w:val="single" w:sz="4" w:space="0" w:color="C9C9C9" w:themeColor="accent3" w:themeTint="99"/>
+            </w:tcBorders>
+            <w:hideMark/>
+          </w:tcPr>
+          <w:p>
+            <w:pPr>
+              <w:spacing w:after="0" w:line="240" w:lineRule="auto"/>
+            </w:pPr>
+            <w:r>
+              <w:t>Prompt Terminate All</w:t>
+            </w:r>
+          </w:p>
+        </w:tc>
+        <w:tc>
+          <w:tcPr>
+            <w:tcW w:w="8398" w:type="dxa"/>
+            <w:tcBorders>
+              <w:top w:val="single" w:sz="4" w:space="0" w:color="C9C9C9" w:themeColor="accent3" w:themeTint="99"/>
+              <w:left w:val="single" w:sz="4" w:space="0" w:color="C9C9C9" w:themeColor="accent3" w:themeTint="99"/>
+              <w:bottom w:val="single" w:sz="4" w:space="0" w:color="C9C9C9" w:themeColor="accent3" w:themeTint="99"/>
+              <w:right w:val="single" w:sz="4" w:space="0" w:color="C9C9C9" w:themeColor="accent3" w:themeTint="99"/>
+            </w:tcBorders>
+            <w:hideMark/>
+          </w:tcPr>
+          <w:p>
+            <w:pPr>
+              <w:spacing w:after="0" w:line="240" w:lineRule="auto"/>
               <w:cnfStyle w:val="000000000000" w:firstRow="0" w:lastRow="0" w:firstColumn="0" w:lastColumn="0" w:oddVBand="0" w:evenVBand="0" w:oddHBand="0" w:evenHBand="0" w:firstRowFirstColumn="0" w:firstRowLastColumn="0" w:lastRowFirstColumn="0" w:lastRowLastColumn="0"/>
             </w:pPr>
+            <w:r>
+              <w:t>Prompt for confirmation before terminating.</w:t>
+            </w:r>
           </w:p>
         </w:tc>
       </w:tr>
@@ -3741,34 +4136,32 @@
         <w:tc>
           <w:tcPr>
             <w:cnfStyle w:val="001000000000" w:firstRow="0" w:lastRow="0" w:firstColumn="1" w:lastColumn="0" w:oddVBand="0" w:evenVBand="0" w:oddHBand="0" w:evenHBand="0" w:firstRowFirstColumn="0" w:firstRowLastColumn="0" w:lastRowFirstColumn="0" w:lastRowLastColumn="0"/>
-            <w:tcW w:w="2830" w:type="dxa"/>
-            <w:tcBorders>
-              <w:top w:val="single" w:sz="4" w:space="0" w:color="C9C9C9" w:themeColor="accent3" w:themeTint="99"/>
-              <w:left w:val="single" w:sz="4" w:space="0" w:color="C9C9C9" w:themeColor="accent3" w:themeTint="99"/>
-              <w:bottom w:val="single" w:sz="4" w:space="0" w:color="C9C9C9" w:themeColor="accent3" w:themeTint="99"/>
-              <w:right w:val="single" w:sz="4" w:space="0" w:color="C9C9C9" w:themeColor="accent3" w:themeTint="99"/>
-            </w:tcBorders>
-            <w:hideMark/>
+            <w:tcW w:w="2392" w:type="dxa"/>
+            <w:tcBorders>
+              <w:top w:val="single" w:sz="4" w:space="0" w:color="C9C9C9" w:themeColor="accent3" w:themeTint="99"/>
+              <w:left w:val="single" w:sz="4" w:space="0" w:color="C9C9C9" w:themeColor="accent3" w:themeTint="99"/>
+              <w:bottom w:val="single" w:sz="4" w:space="0" w:color="C9C9C9" w:themeColor="accent3" w:themeTint="99"/>
+              <w:right w:val="single" w:sz="4" w:space="0" w:color="C9C9C9" w:themeColor="accent3" w:themeTint="99"/>
+            </w:tcBorders>
           </w:tcPr>
           <w:p>
             <w:pPr>
               <w:spacing w:after="0" w:line="240" w:lineRule="auto"/>
             </w:pPr>
             <w:r>
-              <w:t>Prompt Terminate All</w:t>
-            </w:r>
-          </w:p>
-        </w:tc>
-        <w:tc>
-          <w:tcPr>
-            <w:tcW w:w="7938" w:type="dxa"/>
-            <w:tcBorders>
-              <w:top w:val="single" w:sz="4" w:space="0" w:color="C9C9C9" w:themeColor="accent3" w:themeTint="99"/>
-              <w:left w:val="single" w:sz="4" w:space="0" w:color="C9C9C9" w:themeColor="accent3" w:themeTint="99"/>
-              <w:bottom w:val="single" w:sz="4" w:space="0" w:color="C9C9C9" w:themeColor="accent3" w:themeTint="99"/>
-              <w:right w:val="single" w:sz="4" w:space="0" w:color="C9C9C9" w:themeColor="accent3" w:themeTint="99"/>
-            </w:tcBorders>
-            <w:hideMark/>
+              <w:t>Show Search String</w:t>
+            </w:r>
+          </w:p>
+        </w:tc>
+        <w:tc>
+          <w:tcPr>
+            <w:tcW w:w="8398" w:type="dxa"/>
+            <w:tcBorders>
+              <w:top w:val="single" w:sz="4" w:space="0" w:color="C9C9C9" w:themeColor="accent3" w:themeTint="99"/>
+              <w:left w:val="single" w:sz="4" w:space="0" w:color="C9C9C9" w:themeColor="accent3" w:themeTint="99"/>
+              <w:bottom w:val="single" w:sz="4" w:space="0" w:color="C9C9C9" w:themeColor="accent3" w:themeTint="99"/>
+              <w:right w:val="single" w:sz="4" w:space="0" w:color="C9C9C9" w:themeColor="accent3" w:themeTint="99"/>
+            </w:tcBorders>
           </w:tcPr>
           <w:p>
             <w:pPr>
@@ -3776,7 +4169,15 @@
               <w:cnfStyle w:val="000000100000" w:firstRow="0" w:lastRow="0" w:firstColumn="0" w:lastColumn="0" w:oddVBand="0" w:evenVBand="0" w:oddHBand="1" w:evenHBand="0" w:firstRowFirstColumn="0" w:firstRowLastColumn="0" w:lastRowFirstColumn="0" w:lastRowLastColumn="0"/>
             </w:pPr>
             <w:r>
-              <w:t>Prompt for confirmation before terminating.</w:t>
+              <w:t xml:space="preserve">Show search string control in </w:t>
+            </w:r>
+            <w:proofErr w:type="spellStart"/>
+            <w:r>
+              <w:t>AltTab</w:t>
+            </w:r>
+            <w:proofErr w:type="spellEnd"/>
+            <w:r>
+              <w:t xml:space="preserve"> window.</w:t>
             </w:r>
           </w:p>
         </w:tc>
@@ -3785,32 +4186,34 @@
         <w:tc>
           <w:tcPr>
             <w:cnfStyle w:val="001000000000" w:firstRow="0" w:lastRow="0" w:firstColumn="1" w:lastColumn="0" w:oddVBand="0" w:evenVBand="0" w:oddHBand="0" w:evenHBand="0" w:firstRowFirstColumn="0" w:firstRowLastColumn="0" w:lastRowFirstColumn="0" w:lastRowLastColumn="0"/>
-            <w:tcW w:w="2830" w:type="dxa"/>
-            <w:tcBorders>
-              <w:top w:val="single" w:sz="4" w:space="0" w:color="C9C9C9" w:themeColor="accent3" w:themeTint="99"/>
-              <w:left w:val="single" w:sz="4" w:space="0" w:color="C9C9C9" w:themeColor="accent3" w:themeTint="99"/>
-              <w:bottom w:val="single" w:sz="4" w:space="0" w:color="C9C9C9" w:themeColor="accent3" w:themeTint="99"/>
-              <w:right w:val="single" w:sz="4" w:space="0" w:color="C9C9C9" w:themeColor="accent3" w:themeTint="99"/>
-            </w:tcBorders>
+            <w:tcW w:w="2392" w:type="dxa"/>
+            <w:tcBorders>
+              <w:top w:val="single" w:sz="4" w:space="0" w:color="C9C9C9" w:themeColor="accent3" w:themeTint="99"/>
+              <w:left w:val="single" w:sz="4" w:space="0" w:color="C9C9C9" w:themeColor="accent3" w:themeTint="99"/>
+              <w:bottom w:val="single" w:sz="4" w:space="0" w:color="C9C9C9" w:themeColor="accent3" w:themeTint="99"/>
+              <w:right w:val="single" w:sz="4" w:space="0" w:color="C9C9C9" w:themeColor="accent3" w:themeTint="99"/>
+            </w:tcBorders>
+            <w:hideMark/>
           </w:tcPr>
           <w:p>
             <w:pPr>
               <w:spacing w:after="0" w:line="240" w:lineRule="auto"/>
             </w:pPr>
             <w:r>
-              <w:t>Show Search String</w:t>
-            </w:r>
-          </w:p>
-        </w:tc>
-        <w:tc>
-          <w:tcPr>
-            <w:tcW w:w="7938" w:type="dxa"/>
-            <w:tcBorders>
-              <w:top w:val="single" w:sz="4" w:space="0" w:color="C9C9C9" w:themeColor="accent3" w:themeTint="99"/>
-              <w:left w:val="single" w:sz="4" w:space="0" w:color="C9C9C9" w:themeColor="accent3" w:themeTint="99"/>
-              <w:bottom w:val="single" w:sz="4" w:space="0" w:color="C9C9C9" w:themeColor="accent3" w:themeTint="99"/>
-              <w:right w:val="single" w:sz="4" w:space="0" w:color="C9C9C9" w:themeColor="accent3" w:themeTint="99"/>
-            </w:tcBorders>
+              <w:t>Show Column Header</w:t>
+            </w:r>
+          </w:p>
+        </w:tc>
+        <w:tc>
+          <w:tcPr>
+            <w:tcW w:w="8398" w:type="dxa"/>
+            <w:tcBorders>
+              <w:top w:val="single" w:sz="4" w:space="0" w:color="C9C9C9" w:themeColor="accent3" w:themeTint="99"/>
+              <w:left w:val="single" w:sz="4" w:space="0" w:color="C9C9C9" w:themeColor="accent3" w:themeTint="99"/>
+              <w:bottom w:val="single" w:sz="4" w:space="0" w:color="C9C9C9" w:themeColor="accent3" w:themeTint="99"/>
+              <w:right w:val="single" w:sz="4" w:space="0" w:color="C9C9C9" w:themeColor="accent3" w:themeTint="99"/>
+            </w:tcBorders>
+            <w:hideMark/>
           </w:tcPr>
           <w:p>
             <w:pPr>
@@ -3818,7 +4221,15 @@
               <w:cnfStyle w:val="000000000000" w:firstRow="0" w:lastRow="0" w:firstColumn="0" w:lastColumn="0" w:oddVBand="0" w:evenVBand="0" w:oddHBand="0" w:evenHBand="0" w:firstRowFirstColumn="0" w:firstRowLastColumn="0" w:lastRowFirstColumn="0" w:lastRowLastColumn="0"/>
             </w:pPr>
             <w:r>
-              <w:t xml:space="preserve">Show search string control in </w:t>
+              <w:t xml:space="preserve">Show column header for </w:t>
+            </w:r>
+            <w:proofErr w:type="spellStart"/>
+            <w:r>
+              <w:t>listview</w:t>
+            </w:r>
+            <w:proofErr w:type="spellEnd"/>
+            <w:r>
+              <w:t xml:space="preserve"> in </w:t>
             </w:r>
             <w:proofErr w:type="spellStart"/>
             <w:r>
@@ -3838,7 +4249,7 @@
         <w:tc>
           <w:tcPr>
             <w:cnfStyle w:val="001000000000" w:firstRow="0" w:lastRow="0" w:firstColumn="1" w:lastColumn="0" w:oddVBand="0" w:evenVBand="0" w:oddHBand="0" w:evenHBand="0" w:firstRowFirstColumn="0" w:firstRowLastColumn="0" w:lastRowFirstColumn="0" w:lastRowLastColumn="0"/>
-            <w:tcW w:w="2830" w:type="dxa"/>
+            <w:tcW w:w="2392" w:type="dxa"/>
             <w:tcBorders>
               <w:top w:val="single" w:sz="4" w:space="0" w:color="C9C9C9" w:themeColor="accent3" w:themeTint="99"/>
               <w:left w:val="single" w:sz="4" w:space="0" w:color="C9C9C9" w:themeColor="accent3" w:themeTint="99"/>
@@ -3852,13 +4263,13 @@
               <w:spacing w:after="0" w:line="240" w:lineRule="auto"/>
             </w:pPr>
             <w:r>
-              <w:t>Show Column Header</w:t>
-            </w:r>
-          </w:p>
-        </w:tc>
-        <w:tc>
-          <w:tcPr>
-            <w:tcW w:w="7938" w:type="dxa"/>
+              <w:t>Show Column Process Name</w:t>
+            </w:r>
+          </w:p>
+        </w:tc>
+        <w:tc>
+          <w:tcPr>
+            <w:tcW w:w="8398" w:type="dxa"/>
             <w:tcBorders>
               <w:top w:val="single" w:sz="4" w:space="0" w:color="C9C9C9" w:themeColor="accent3" w:themeTint="99"/>
               <w:left w:val="single" w:sz="4" w:space="0" w:color="C9C9C9" w:themeColor="accent3" w:themeTint="99"/>
@@ -3871,9 +4282,12 @@
             <w:pPr>
               <w:spacing w:after="0" w:line="240" w:lineRule="auto"/>
               <w:cnfStyle w:val="000000100000" w:firstRow="0" w:lastRow="0" w:firstColumn="0" w:lastColumn="0" w:oddVBand="0" w:evenVBand="0" w:oddHBand="1" w:evenHBand="0" w:firstRowFirstColumn="0" w:firstRowLastColumn="0" w:lastRowFirstColumn="0" w:lastRowLastColumn="0"/>
-            </w:pPr>
-            <w:r>
-              <w:t xml:space="preserve">Show column header for </w:t>
+              <w:rPr>
+                <w:color w:val="FF0000"/>
+              </w:rPr>
+            </w:pPr>
+            <w:r>
+              <w:t xml:space="preserve">Add the process name column to </w:t>
             </w:r>
             <w:proofErr w:type="spellStart"/>
             <w:r>
@@ -3898,58 +4312,29 @@
         <w:tc>
           <w:tcPr>
             <w:cnfStyle w:val="001000000000" w:firstRow="0" w:lastRow="0" w:firstColumn="1" w:lastColumn="0" w:oddVBand="0" w:evenVBand="0" w:oddHBand="0" w:evenHBand="0" w:firstRowFirstColumn="0" w:firstRowLastColumn="0" w:lastRowFirstColumn="0" w:lastRowLastColumn="0"/>
-            <w:tcW w:w="2830" w:type="dxa"/>
-            <w:tcBorders>
-              <w:top w:val="single" w:sz="4" w:space="0" w:color="C9C9C9" w:themeColor="accent3" w:themeTint="99"/>
-              <w:left w:val="single" w:sz="4" w:space="0" w:color="C9C9C9" w:themeColor="accent3" w:themeTint="99"/>
-              <w:bottom w:val="single" w:sz="4" w:space="0" w:color="C9C9C9" w:themeColor="accent3" w:themeTint="99"/>
-              <w:right w:val="single" w:sz="4" w:space="0" w:color="C9C9C9" w:themeColor="accent3" w:themeTint="99"/>
-            </w:tcBorders>
-            <w:hideMark/>
+            <w:tcW w:w="10790" w:type="dxa"/>
+            <w:gridSpan w:val="2"/>
+            <w:tcBorders>
+              <w:top w:val="single" w:sz="4" w:space="0" w:color="C9C9C9" w:themeColor="accent3" w:themeTint="99"/>
+              <w:left w:val="single" w:sz="4" w:space="0" w:color="C9C9C9" w:themeColor="accent3" w:themeTint="99"/>
+              <w:bottom w:val="single" w:sz="4" w:space="0" w:color="C9C9C9" w:themeColor="accent3" w:themeTint="99"/>
+              <w:right w:val="single" w:sz="4" w:space="0" w:color="C9C9C9" w:themeColor="accent3" w:themeTint="99"/>
+            </w:tcBorders>
+            <w:shd w:val="clear" w:color="auto" w:fill="BDD6EE" w:themeFill="accent1" w:themeFillTint="66"/>
           </w:tcPr>
           <w:p>
             <w:pPr>
               <w:spacing w:after="0" w:line="240" w:lineRule="auto"/>
-            </w:pPr>
-            <w:r>
-              <w:t>Show Column Process Name</w:t>
-            </w:r>
-          </w:p>
-        </w:tc>
-        <w:tc>
-          <w:tcPr>
-            <w:tcW w:w="7938" w:type="dxa"/>
-            <w:tcBorders>
-              <w:top w:val="single" w:sz="4" w:space="0" w:color="C9C9C9" w:themeColor="accent3" w:themeTint="99"/>
-              <w:left w:val="single" w:sz="4" w:space="0" w:color="C9C9C9" w:themeColor="accent3" w:themeTint="99"/>
-              <w:bottom w:val="single" w:sz="4" w:space="0" w:color="C9C9C9" w:themeColor="accent3" w:themeTint="99"/>
-              <w:right w:val="single" w:sz="4" w:space="0" w:color="C9C9C9" w:themeColor="accent3" w:themeTint="99"/>
-            </w:tcBorders>
-            <w:hideMark/>
-          </w:tcPr>
-          <w:p>
-            <w:pPr>
-              <w:spacing w:after="0" w:line="240" w:lineRule="auto"/>
-              <w:cnfStyle w:val="000000000000" w:firstRow="0" w:lastRow="0" w:firstColumn="0" w:lastColumn="0" w:oddVBand="0" w:evenVBand="0" w:oddHBand="0" w:evenHBand="0" w:firstRowFirstColumn="0" w:firstRowLastColumn="0" w:lastRowFirstColumn="0" w:lastRowLastColumn="0"/>
-            </w:pPr>
-            <w:r>
-              <w:t xml:space="preserve">Add the process name column to </w:t>
-            </w:r>
-            <w:proofErr w:type="spellStart"/>
-            <w:r>
-              <w:t>listview</w:t>
-            </w:r>
-            <w:proofErr w:type="spellEnd"/>
-            <w:r>
-              <w:t xml:space="preserve"> in </w:t>
-            </w:r>
-            <w:proofErr w:type="spellStart"/>
-            <w:r>
-              <w:t>AltTab</w:t>
-            </w:r>
-            <w:proofErr w:type="spellEnd"/>
-            <w:r>
-              <w:t xml:space="preserve"> window.</w:t>
+              <w:jc w:val="center"/>
+              <w:rPr>
+                <w:color w:val="002060"/>
+              </w:rPr>
+            </w:pPr>
+            <w:r>
+              <w:rPr>
+                <w:color w:val="002060"/>
+              </w:rPr>
+              <w:t>Mouse Hover Group</w:t>
             </w:r>
           </w:p>
         </w:tc>
@@ -3961,7 +4346,7 @@
         <w:tc>
           <w:tcPr>
             <w:cnfStyle w:val="001000000000" w:firstRow="0" w:lastRow="0" w:firstColumn="1" w:lastColumn="0" w:oddVBand="0" w:evenVBand="0" w:oddHBand="0" w:evenHBand="0" w:firstRowFirstColumn="0" w:firstRowLastColumn="0" w:lastRowFirstColumn="0" w:lastRowLastColumn="0"/>
-            <w:tcW w:w="2830" w:type="dxa"/>
+            <w:tcW w:w="2392" w:type="dxa"/>
             <w:tcBorders>
               <w:top w:val="single" w:sz="4" w:space="0" w:color="C9C9C9" w:themeColor="accent3" w:themeTint="99"/>
               <w:left w:val="single" w:sz="4" w:space="0" w:color="C9C9C9" w:themeColor="accent3" w:themeTint="99"/>
@@ -3973,19 +4358,22 @@
             <w:pPr>
               <w:spacing w:after="0" w:line="240" w:lineRule="auto"/>
             </w:pPr>
+            <w:r>
+              <w:t xml:space="preserve">Show </w:t>
+            </w:r>
             <w:proofErr w:type="spellStart"/>
             <w:r>
-              <w:t>Alt+Ctrl+Tab</w:t>
+              <w:t>ProcessInfo</w:t>
             </w:r>
             <w:proofErr w:type="spellEnd"/>
             <w:r>
-              <w:t xml:space="preserve"> Hotkey</w:t>
-            </w:r>
-          </w:p>
-        </w:tc>
-        <w:tc>
-          <w:tcPr>
-            <w:tcW w:w="7938" w:type="dxa"/>
+              <w:t xml:space="preserve"> Tooltip</w:t>
+            </w:r>
+          </w:p>
+        </w:tc>
+        <w:tc>
+          <w:tcPr>
+            <w:tcW w:w="8398" w:type="dxa"/>
             <w:tcBorders>
               <w:top w:val="single" w:sz="4" w:space="0" w:color="C9C9C9" w:themeColor="accent3" w:themeTint="99"/>
               <w:left w:val="single" w:sz="4" w:space="0" w:color="C9C9C9" w:themeColor="accent3" w:themeTint="99"/>
@@ -3999,29 +4387,65 @@
               <w:cnfStyle w:val="000000100000" w:firstRow="0" w:lastRow="0" w:firstColumn="0" w:lastColumn="0" w:oddVBand="0" w:evenVBand="0" w:oddHBand="1" w:evenHBand="0" w:firstRowFirstColumn="0" w:firstRowLastColumn="0" w:lastRowFirstColumn="0" w:lastRowLastColumn="0"/>
             </w:pPr>
             <w:r>
-              <w:t xml:space="preserve">Enable/disable </w:t>
-            </w:r>
-            <w:proofErr w:type="spellStart"/>
-            <w:r>
-              <w:t>Alt+Ctrl+Tab</w:t>
-            </w:r>
-            <w:proofErr w:type="spellEnd"/>
+              <w:t>Displays the process information (Ex: Title, Path, Description, Company</w:t>
+            </w:r>
             <w:r>
               <w:t xml:space="preserve"> </w:t>
             </w:r>
             <w:r>
-              <w:t>hotkey</w:t>
-            </w:r>
-            <w:r>
-              <w:t xml:space="preserve">, which displays </w:t>
-            </w:r>
-            <w:proofErr w:type="spellStart"/>
-            <w:r>
-              <w:t>AltTab</w:t>
-            </w:r>
-            <w:proofErr w:type="spellEnd"/>
-            <w:r>
-              <w:t xml:space="preserve"> window and remains open even Alt key is released</w:t>
+              <w:t>Name and Process</w:t>
+            </w:r>
+            <w:r>
+              <w:t xml:space="preserve"> </w:t>
+            </w:r>
+            <w:r>
+              <w:t>ID) in the tooltip as shown below:</w:t>
+            </w:r>
+          </w:p>
+          <w:p>
+            <w:pPr>
+              <w:spacing w:after="0" w:line="240" w:lineRule="auto"/>
+              <w:cnfStyle w:val="000000100000" w:firstRow="0" w:lastRow="0" w:firstColumn="0" w:lastColumn="0" w:oddVBand="0" w:evenVBand="0" w:oddHBand="1" w:evenHBand="0" w:firstRowFirstColumn="0" w:firstRowLastColumn="0" w:lastRowFirstColumn="0" w:lastRowLastColumn="0"/>
+            </w:pPr>
+            <w:r>
+              <w:rPr>
+                <w:noProof/>
+              </w:rPr>
+              <w:drawing>
+                <wp:inline distT="0" distB="0" distL="0" distR="0" wp14:anchorId="370672F0" wp14:editId="0D744166">
+                  <wp:extent cx="4114286" cy="800000"/>
+                  <wp:effectExtent l="0" t="0" r="635" b="635"/>
+                  <wp:docPr id="531652829" name="Picture 1"/>
+                  <wp:cNvGraphicFramePr>
+                    <a:graphicFrameLocks xmlns:a="http://schemas.openxmlformats.org/drawingml/2006/main" noChangeAspect="1"/>
+                  </wp:cNvGraphicFramePr>
+                  <a:graphic xmlns:a="http://schemas.openxmlformats.org/drawingml/2006/main">
+                    <a:graphicData uri="http://schemas.openxmlformats.org/drawingml/2006/picture">
+                      <pic:pic xmlns:pic="http://schemas.openxmlformats.org/drawingml/2006/picture">
+                        <pic:nvPicPr>
+                          <pic:cNvPr id="531652829" name=""/>
+                          <pic:cNvPicPr/>
+                        </pic:nvPicPr>
+                        <pic:blipFill>
+                          <a:blip r:embed="rId19"/>
+                          <a:stretch>
+                            <a:fillRect/>
+                          </a:stretch>
+                        </pic:blipFill>
+                        <pic:spPr>
+                          <a:xfrm>
+                            <a:off x="0" y="0"/>
+                            <a:ext cx="4114286" cy="800000"/>
+                          </a:xfrm>
+                          <a:prstGeom prst="rect">
+                            <a:avLst/>
+                          </a:prstGeom>
+                        </pic:spPr>
+                      </pic:pic>
+                    </a:graphicData>
+                  </a:graphic>
+                </wp:inline>
+              </w:drawing>
             </w:r>
           </w:p>
         </w:tc>
@@ -4030,39 +4454,263 @@
         <w:tc>
           <w:tcPr>
             <w:cnfStyle w:val="001000000000" w:firstRow="0" w:lastRow="0" w:firstColumn="1" w:lastColumn="0" w:oddVBand="0" w:evenVBand="0" w:oddHBand="0" w:evenHBand="0" w:firstRowFirstColumn="0" w:firstRowLastColumn="0" w:lastRowFirstColumn="0" w:lastRowLastColumn="0"/>
-            <w:tcW w:w="2830" w:type="dxa"/>
-            <w:tcBorders>
-              <w:top w:val="single" w:sz="4" w:space="0" w:color="C9C9C9" w:themeColor="accent3" w:themeTint="99"/>
-              <w:left w:val="single" w:sz="4" w:space="0" w:color="C9C9C9" w:themeColor="accent3" w:themeTint="99"/>
-              <w:bottom w:val="single" w:sz="4" w:space="0" w:color="C9C9C9" w:themeColor="accent3" w:themeTint="99"/>
-              <w:right w:val="single" w:sz="4" w:space="0" w:color="C9C9C9" w:themeColor="accent3" w:themeTint="99"/>
-            </w:tcBorders>
-            <w:hideMark/>
+            <w:tcW w:w="2392" w:type="dxa"/>
+            <w:tcBorders>
+              <w:top w:val="single" w:sz="4" w:space="0" w:color="C9C9C9" w:themeColor="accent3" w:themeTint="99"/>
+              <w:left w:val="single" w:sz="4" w:space="0" w:color="C9C9C9" w:themeColor="accent3" w:themeTint="99"/>
+              <w:bottom w:val="single" w:sz="4" w:space="0" w:color="C9C9C9" w:themeColor="accent3" w:themeTint="99"/>
+              <w:right w:val="single" w:sz="4" w:space="0" w:color="C9C9C9" w:themeColor="accent3" w:themeTint="99"/>
+            </w:tcBorders>
           </w:tcPr>
           <w:p>
             <w:pPr>
               <w:spacing w:after="0" w:line="240" w:lineRule="auto"/>
             </w:pPr>
             <w:r>
-              <w:t>Similar Process Groups</w:t>
-            </w:r>
-          </w:p>
-        </w:tc>
-        <w:tc>
-          <w:tcPr>
-            <w:tcW w:w="7938" w:type="dxa"/>
-            <w:tcBorders>
-              <w:top w:val="single" w:sz="4" w:space="0" w:color="C9C9C9" w:themeColor="accent3" w:themeTint="99"/>
-              <w:left w:val="single" w:sz="4" w:space="0" w:color="C9C9C9" w:themeColor="accent3" w:themeTint="99"/>
-              <w:bottom w:val="single" w:sz="4" w:space="0" w:color="C9C9C9" w:themeColor="accent3" w:themeTint="99"/>
-              <w:right w:val="single" w:sz="4" w:space="0" w:color="C9C9C9" w:themeColor="accent3" w:themeTint="99"/>
-            </w:tcBorders>
-            <w:hideMark/>
+              <w:t>Show Highlight Rectangle</w:t>
+            </w:r>
+          </w:p>
+        </w:tc>
+        <w:tc>
+          <w:tcPr>
+            <w:tcW w:w="8398" w:type="dxa"/>
+            <w:tcBorders>
+              <w:top w:val="single" w:sz="4" w:space="0" w:color="C9C9C9" w:themeColor="accent3" w:themeTint="99"/>
+              <w:left w:val="single" w:sz="4" w:space="0" w:color="C9C9C9" w:themeColor="accent3" w:themeTint="99"/>
+              <w:bottom w:val="single" w:sz="4" w:space="0" w:color="C9C9C9" w:themeColor="accent3" w:themeTint="99"/>
+              <w:right w:val="single" w:sz="4" w:space="0" w:color="C9C9C9" w:themeColor="accent3" w:themeTint="99"/>
+            </w:tcBorders>
           </w:tcPr>
           <w:p>
             <w:pPr>
               <w:spacing w:after="0" w:line="240" w:lineRule="auto"/>
               <w:cnfStyle w:val="000000000000" w:firstRow="0" w:lastRow="0" w:firstColumn="0" w:lastColumn="0" w:oddVBand="0" w:evenVBand="0" w:oddHBand="0" w:evenHBand="0" w:firstRowFirstColumn="0" w:firstRowLastColumn="0" w:lastRowFirstColumn="0" w:lastRowLastColumn="0"/>
+            </w:pPr>
+            <w:r>
+              <w:t>Displays a rectangle thin line on the mouse hover item as shown below:</w:t>
+            </w:r>
+            <w:r>
+              <w:br/>
+            </w:r>
+            <w:r>
+              <w:rPr>
+                <w:noProof/>
+              </w:rPr>
+              <w:drawing>
+                <wp:inline distT="0" distB="0" distL="0" distR="0" wp14:anchorId="40FFB4D1" wp14:editId="638969EF">
+                  <wp:extent cx="2819400" cy="595630"/>
+                  <wp:effectExtent l="0" t="0" r="0" b="0"/>
+                  <wp:docPr id="1535199503" name="Picture 1"/>
+                  <wp:cNvGraphicFramePr>
+                    <a:graphicFrameLocks xmlns:a="http://schemas.openxmlformats.org/drawingml/2006/main" noChangeAspect="1"/>
+                  </wp:cNvGraphicFramePr>
+                  <a:graphic xmlns:a="http://schemas.openxmlformats.org/drawingml/2006/main">
+                    <a:graphicData uri="http://schemas.openxmlformats.org/drawingml/2006/picture">
+                      <pic:pic xmlns:pic="http://schemas.openxmlformats.org/drawingml/2006/picture">
+                        <pic:nvPicPr>
+                          <pic:cNvPr id="1535199503" name=""/>
+                          <pic:cNvPicPr/>
+                        </pic:nvPicPr>
+                        <pic:blipFill rotWithShape="1">
+                          <a:blip r:embed="rId20"/>
+                          <a:srcRect l="31944" r="26945"/>
+                          <a:stretch>
+                            <a:fillRect/>
+                          </a:stretch>
+                        </pic:blipFill>
+                        <pic:spPr bwMode="auto">
+                          <a:xfrm>
+                            <a:off x="0" y="0"/>
+                            <a:ext cx="2819400" cy="595630"/>
+                          </a:xfrm>
+                          <a:prstGeom prst="rect">
+                            <a:avLst/>
+                          </a:prstGeom>
+                          <a:ln>
+                            <a:noFill/>
+                          </a:ln>
+                          <a:extLst>
+                            <a:ext uri="{53640926-AAD7-44D8-BBD7-CCE9431645EC}">
+                              <a14:shadowObscured xmlns:a14="http://schemas.microsoft.com/office/drawing/2010/main"/>
+                            </a:ext>
+                          </a:extLst>
+                        </pic:spPr>
+                      </pic:pic>
+                    </a:graphicData>
+                  </a:graphic>
+                </wp:inline>
+              </w:drawing>
+            </w:r>
+          </w:p>
+        </w:tc>
+      </w:tr>
+      <w:tr>
+        <w:trPr>
+          <w:cnfStyle w:val="000000100000" w:firstRow="0" w:lastRow="0" w:firstColumn="0" w:lastColumn="0" w:oddVBand="0" w:evenVBand="0" w:oddHBand="1" w:evenHBand="0" w:firstRowFirstColumn="0" w:firstRowLastColumn="0" w:lastRowFirstColumn="0" w:lastRowLastColumn="0"/>
+        </w:trPr>
+        <w:tc>
+          <w:tcPr>
+            <w:cnfStyle w:val="001000000000" w:firstRow="0" w:lastRow="0" w:firstColumn="1" w:lastColumn="0" w:oddVBand="0" w:evenVBand="0" w:oddHBand="0" w:evenHBand="0" w:firstRowFirstColumn="0" w:firstRowLastColumn="0" w:lastRowFirstColumn="0" w:lastRowLastColumn="0"/>
+            <w:tcW w:w="2392" w:type="dxa"/>
+            <w:tcBorders>
+              <w:top w:val="single" w:sz="4" w:space="0" w:color="C9C9C9" w:themeColor="accent3" w:themeTint="99"/>
+              <w:left w:val="single" w:sz="4" w:space="0" w:color="C9C9C9" w:themeColor="accent3" w:themeTint="99"/>
+              <w:bottom w:val="single" w:sz="4" w:space="0" w:color="C9C9C9" w:themeColor="accent3" w:themeTint="99"/>
+              <w:right w:val="single" w:sz="4" w:space="0" w:color="C9C9C9" w:themeColor="accent3" w:themeTint="99"/>
+            </w:tcBorders>
+          </w:tcPr>
+          <w:p>
+            <w:pPr>
+              <w:spacing w:after="0" w:line="240" w:lineRule="auto"/>
+            </w:pPr>
+            <w:r>
+              <w:t>Show Delete Button</w:t>
+            </w:r>
+          </w:p>
+        </w:tc>
+        <w:tc>
+          <w:tcPr>
+            <w:tcW w:w="8398" w:type="dxa"/>
+            <w:tcBorders>
+              <w:top w:val="single" w:sz="4" w:space="0" w:color="C9C9C9" w:themeColor="accent3" w:themeTint="99"/>
+              <w:left w:val="single" w:sz="4" w:space="0" w:color="C9C9C9" w:themeColor="accent3" w:themeTint="99"/>
+              <w:bottom w:val="single" w:sz="4" w:space="0" w:color="C9C9C9" w:themeColor="accent3" w:themeTint="99"/>
+              <w:right w:val="single" w:sz="4" w:space="0" w:color="C9C9C9" w:themeColor="accent3" w:themeTint="99"/>
+            </w:tcBorders>
+          </w:tcPr>
+          <w:p>
+            <w:pPr>
+              <w:spacing w:after="0" w:line="240" w:lineRule="auto"/>
+              <w:cnfStyle w:val="000000100000" w:firstRow="0" w:lastRow="0" w:firstColumn="0" w:lastColumn="0" w:oddVBand="0" w:evenVBand="0" w:oddHBand="1" w:evenHBand="0" w:firstRowFirstColumn="0" w:firstRowLastColumn="0" w:lastRowFirstColumn="0" w:lastRowLastColumn="0"/>
+            </w:pPr>
+            <w:r>
+              <w:t>Displays a delete button on the mouse hover item as shown below:</w:t>
+            </w:r>
+            <w:r>
+              <w:br/>
+            </w:r>
+            <w:r>
+              <w:rPr>
+                <w:noProof/>
+              </w:rPr>
+              <w:drawing>
+                <wp:inline distT="0" distB="0" distL="0" distR="0" wp14:anchorId="67CD0FF9" wp14:editId="40EAAD2E">
+                  <wp:extent cx="542857" cy="485714"/>
+                  <wp:effectExtent l="0" t="0" r="0" b="0"/>
+                  <wp:docPr id="1887903698" name="Picture 1"/>
+                  <wp:cNvGraphicFramePr>
+                    <a:graphicFrameLocks xmlns:a="http://schemas.openxmlformats.org/drawingml/2006/main" noChangeAspect="1"/>
+                  </wp:cNvGraphicFramePr>
+                  <a:graphic xmlns:a="http://schemas.openxmlformats.org/drawingml/2006/main">
+                    <a:graphicData uri="http://schemas.openxmlformats.org/drawingml/2006/picture">
+                      <pic:pic xmlns:pic="http://schemas.openxmlformats.org/drawingml/2006/picture">
+                        <pic:nvPicPr>
+                          <pic:cNvPr id="1887903698" name=""/>
+                          <pic:cNvPicPr/>
+                        </pic:nvPicPr>
+                        <pic:blipFill>
+                          <a:blip r:embed="rId21"/>
+                          <a:stretch>
+                            <a:fillRect/>
+                          </a:stretch>
+                        </pic:blipFill>
+                        <pic:spPr>
+                          <a:xfrm>
+                            <a:off x="0" y="0"/>
+                            <a:ext cx="542857" cy="485714"/>
+                          </a:xfrm>
+                          <a:prstGeom prst="rect">
+                            <a:avLst/>
+                          </a:prstGeom>
+                        </pic:spPr>
+                      </pic:pic>
+                    </a:graphicData>
+                  </a:graphic>
+                </wp:inline>
+              </w:drawing>
+            </w:r>
+          </w:p>
+        </w:tc>
+      </w:tr>
+      <w:tr>
+        <w:tc>
+          <w:tcPr>
+            <w:cnfStyle w:val="001000000000" w:firstRow="0" w:lastRow="0" w:firstColumn="1" w:lastColumn="0" w:oddVBand="0" w:evenVBand="0" w:oddHBand="0" w:evenHBand="0" w:firstRowFirstColumn="0" w:firstRowLastColumn="0" w:lastRowFirstColumn="0" w:lastRowLastColumn="0"/>
+            <w:tcW w:w="10790" w:type="dxa"/>
+            <w:gridSpan w:val="2"/>
+            <w:tcBorders>
+              <w:top w:val="single" w:sz="4" w:space="0" w:color="C9C9C9" w:themeColor="accent3" w:themeTint="99"/>
+              <w:left w:val="single" w:sz="4" w:space="0" w:color="C9C9C9" w:themeColor="accent3" w:themeTint="99"/>
+              <w:bottom w:val="single" w:sz="4" w:space="0" w:color="C9C9C9" w:themeColor="accent3" w:themeTint="99"/>
+              <w:right w:val="single" w:sz="4" w:space="0" w:color="C9C9C9" w:themeColor="accent3" w:themeTint="99"/>
+            </w:tcBorders>
+            <w:shd w:val="clear" w:color="auto" w:fill="BDD6EE" w:themeFill="accent1" w:themeFillTint="66"/>
+          </w:tcPr>
+          <w:p>
+            <w:pPr>
+              <w:spacing w:after="0" w:line="240" w:lineRule="auto"/>
+              <w:jc w:val="center"/>
+              <w:rPr>
+                <w:color w:val="002060"/>
+              </w:rPr>
+            </w:pPr>
+            <w:bookmarkStart w:id="11" w:name="_Hlk218327871"/>
+            <w:r>
+              <w:rPr>
+                <w:color w:val="002060"/>
+              </w:rPr>
+              <w:t>Alt Backtick</w:t>
+            </w:r>
+            <w:r>
+              <w:rPr>
+                <w:color w:val="002060"/>
+              </w:rPr>
+              <w:t xml:space="preserve"> Group</w:t>
+            </w:r>
+          </w:p>
+        </w:tc>
+      </w:tr>
+      <w:bookmarkEnd w:id="11"/>
+      <w:tr>
+        <w:trPr>
+          <w:cnfStyle w:val="000000100000" w:firstRow="0" w:lastRow="0" w:firstColumn="0" w:lastColumn="0" w:oddVBand="0" w:evenVBand="0" w:oddHBand="1" w:evenHBand="0" w:firstRowFirstColumn="0" w:firstRowLastColumn="0" w:lastRowFirstColumn="0" w:lastRowLastColumn="0"/>
+        </w:trPr>
+        <w:tc>
+          <w:tcPr>
+            <w:cnfStyle w:val="001000000000" w:firstRow="0" w:lastRow="0" w:firstColumn="1" w:lastColumn="0" w:oddVBand="0" w:evenVBand="0" w:oddHBand="0" w:evenHBand="0" w:firstRowFirstColumn="0" w:firstRowLastColumn="0" w:lastRowFirstColumn="0" w:lastRowLastColumn="0"/>
+            <w:tcW w:w="2392" w:type="dxa"/>
+            <w:tcBorders>
+              <w:top w:val="single" w:sz="4" w:space="0" w:color="C9C9C9" w:themeColor="accent3" w:themeTint="99"/>
+              <w:left w:val="single" w:sz="4" w:space="0" w:color="C9C9C9" w:themeColor="accent3" w:themeTint="99"/>
+              <w:bottom w:val="single" w:sz="4" w:space="0" w:color="C9C9C9" w:themeColor="accent3" w:themeTint="99"/>
+              <w:right w:val="single" w:sz="4" w:space="0" w:color="C9C9C9" w:themeColor="accent3" w:themeTint="99"/>
+            </w:tcBorders>
+            <w:hideMark/>
+          </w:tcPr>
+          <w:p>
+            <w:pPr>
+              <w:spacing w:after="0" w:line="240" w:lineRule="auto"/>
+            </w:pPr>
+            <w:r>
+              <w:t>Similar Process Groups</w:t>
+            </w:r>
+          </w:p>
+        </w:tc>
+        <w:tc>
+          <w:tcPr>
+            <w:tcW w:w="8398" w:type="dxa"/>
+            <w:tcBorders>
+              <w:top w:val="single" w:sz="4" w:space="0" w:color="C9C9C9" w:themeColor="accent3" w:themeTint="99"/>
+              <w:left w:val="single" w:sz="4" w:space="0" w:color="C9C9C9" w:themeColor="accent3" w:themeTint="99"/>
+              <w:bottom w:val="single" w:sz="4" w:space="0" w:color="C9C9C9" w:themeColor="accent3" w:themeTint="99"/>
+              <w:right w:val="single" w:sz="4" w:space="0" w:color="C9C9C9" w:themeColor="accent3" w:themeTint="99"/>
+            </w:tcBorders>
+            <w:hideMark/>
+          </w:tcPr>
+          <w:p>
+            <w:pPr>
+              <w:spacing w:after="0" w:line="240" w:lineRule="auto"/>
+              <w:cnfStyle w:val="000000100000" w:firstRow="0" w:lastRow="0" w:firstColumn="0" w:lastColumn="0" w:oddVBand="0" w:evenVBand="0" w:oddHBand="1" w:evenHBand="0" w:firstRowFirstColumn="0" w:firstRowLastColumn="0" w:lastRowFirstColumn="0" w:lastRowLastColumn="0"/>
             </w:pPr>
             <w:r>
               <w:t xml:space="preserve">Define similar processes as one group to switch between these processes using </w:t>
@@ -4082,7 +4730,7 @@
                 <w:numId w:val="4"/>
               </w:numPr>
               <w:spacing w:after="0" w:line="240" w:lineRule="auto"/>
-              <w:cnfStyle w:val="000000000000" w:firstRow="0" w:lastRow="0" w:firstColumn="0" w:lastColumn="0" w:oddVBand="0" w:evenVBand="0" w:oddHBand="0" w:evenHBand="0" w:firstRowFirstColumn="0" w:firstRowLastColumn="0" w:lastRowFirstColumn="0" w:lastRowLastColumn="0"/>
+              <w:cnfStyle w:val="000000100000" w:firstRow="0" w:lastRow="0" w:firstColumn="0" w:lastColumn="0" w:oddVBand="0" w:evenVBand="0" w:oddHBand="1" w:evenHBand="0" w:firstRowFirstColumn="0" w:firstRowLastColumn="0" w:lastRowFirstColumn="0" w:lastRowLastColumn="0"/>
             </w:pPr>
             <w:r>
               <w:t>Processes in a process group are separated by forward slash (/) and process groups are separated by Pipe/Vertical Bar (|).</w:t>
@@ -4096,7 +4744,7 @@
                 <w:numId w:val="4"/>
               </w:numPr>
               <w:spacing w:after="0" w:line="240" w:lineRule="auto"/>
-              <w:cnfStyle w:val="000000000000" w:firstRow="0" w:lastRow="0" w:firstColumn="0" w:lastColumn="0" w:oddVBand="0" w:evenVBand="0" w:oddHBand="0" w:evenHBand="0" w:firstRowFirstColumn="0" w:firstRowLastColumn="0" w:lastRowFirstColumn="0" w:lastRowLastColumn="0"/>
+              <w:cnfStyle w:val="000000100000" w:firstRow="0" w:lastRow="0" w:firstColumn="0" w:lastColumn="0" w:oddVBand="0" w:evenVBand="0" w:oddHBand="1" w:evenHBand="0" w:firstRowFirstColumn="0" w:firstRowLastColumn="0" w:lastRowFirstColumn="0" w:lastRowLastColumn="0"/>
             </w:pPr>
             <w:r>
               <w:t xml:space="preserve">A file/process name can't contain any of the following characters: </w:t>
@@ -4139,12 +4787,12 @@
           <w:p>
             <w:pPr>
               <w:spacing w:after="0" w:line="240" w:lineRule="auto"/>
-              <w:cnfStyle w:val="000000000000" w:firstRow="0" w:lastRow="0" w:firstColumn="0" w:lastColumn="0" w:oddVBand="0" w:evenVBand="0" w:oddHBand="0" w:evenHBand="0" w:firstRowFirstColumn="0" w:firstRowLastColumn="0" w:lastRowFirstColumn="0" w:lastRowLastColumn="0"/>
+              <w:cnfStyle w:val="000000100000" w:firstRow="0" w:lastRow="0" w:firstColumn="0" w:lastColumn="0" w:oddVBand="0" w:evenVBand="0" w:oddHBand="1" w:evenHBand="0" w:firstRowFirstColumn="0" w:firstRowLastColumn="0" w:lastRowFirstColumn="0" w:lastRowLastColumn="0"/>
               <w:rPr>
                 <w:color w:val="FF0000"/>
               </w:rPr>
             </w:pPr>
-            <w:bookmarkStart w:id="10" w:name="_Hlk161561271"/>
+            <w:bookmarkStart w:id="12" w:name="_Hlk161561271"/>
             <w:r>
               <w:rPr>
                 <w:b/>
@@ -4179,7 +4827,7 @@
           <w:p>
             <w:pPr>
               <w:spacing w:after="0" w:line="240" w:lineRule="auto"/>
-              <w:cnfStyle w:val="000000000000" w:firstRow="0" w:lastRow="0" w:firstColumn="0" w:lastColumn="0" w:oddVBand="0" w:evenVBand="0" w:oddHBand="0" w:evenHBand="0" w:firstRowFirstColumn="0" w:firstRowLastColumn="0" w:lastRowFirstColumn="0" w:lastRowLastColumn="0"/>
+              <w:cnfStyle w:val="000000100000" w:firstRow="0" w:lastRow="0" w:firstColumn="0" w:lastColumn="0" w:oddVBand="0" w:evenVBand="0" w:oddHBand="1" w:evenHBand="0" w:firstRowFirstColumn="0" w:firstRowLastColumn="0" w:lastRowFirstColumn="0" w:lastRowLastColumn="0"/>
               <w:rPr>
                 <w:color w:val="00B050"/>
               </w:rPr>
@@ -4190,11 +4838,11 @@
               </w:rPr>
               <w:t>chrome.exe/firefox.exe</w:t>
             </w:r>
-            <w:bookmarkStart w:id="11" w:name="_Hlk161560529"/>
+            <w:bookmarkStart w:id="13" w:name="_Hlk161560529"/>
             <w:r>
               <w:t>|</w:t>
             </w:r>
-            <w:bookmarkEnd w:id="11"/>
+            <w:bookmarkEnd w:id="13"/>
             <w:r>
               <w:rPr>
                 <w:color w:val="00B050"/>
@@ -4205,7 +4853,7 @@
           <w:p>
             <w:pPr>
               <w:spacing w:after="0" w:line="240" w:lineRule="auto"/>
-              <w:cnfStyle w:val="000000000000" w:firstRow="0" w:lastRow="0" w:firstColumn="0" w:lastColumn="0" w:oddVBand="0" w:evenVBand="0" w:oddHBand="0" w:evenHBand="0" w:firstRowFirstColumn="0" w:firstRowLastColumn="0" w:lastRowFirstColumn="0" w:lastRowLastColumn="0"/>
+              <w:cnfStyle w:val="000000100000" w:firstRow="0" w:lastRow="0" w:firstColumn="0" w:lastColumn="0" w:oddVBand="0" w:evenVBand="0" w:oddHBand="1" w:evenHBand="0" w:firstRowFirstColumn="0" w:firstRowLastColumn="0" w:lastRowFirstColumn="0" w:lastRowLastColumn="0"/>
             </w:pPr>
             <w:r>
               <w:rPr>
@@ -4222,7 +4870,38 @@
               </w:rPr>
               <w:t>cmd.exe/WindowsTerminal.exe/conemu.exe/conemu64.exe</w:t>
             </w:r>
-            <w:bookmarkEnd w:id="10"/>
+            <w:bookmarkEnd w:id="12"/>
+          </w:p>
+        </w:tc>
+      </w:tr>
+      <w:tr>
+        <w:tc>
+          <w:tcPr>
+            <w:cnfStyle w:val="001000000000" w:firstRow="0" w:lastRow="0" w:firstColumn="1" w:lastColumn="0" w:oddVBand="0" w:evenVBand="0" w:oddHBand="0" w:evenHBand="0" w:firstRowFirstColumn="0" w:firstRowLastColumn="0" w:lastRowFirstColumn="0" w:lastRowLastColumn="0"/>
+            <w:tcW w:w="10790" w:type="dxa"/>
+            <w:gridSpan w:val="2"/>
+            <w:tcBorders>
+              <w:top w:val="single" w:sz="4" w:space="0" w:color="C9C9C9" w:themeColor="accent3" w:themeTint="99"/>
+              <w:left w:val="single" w:sz="4" w:space="0" w:color="C9C9C9" w:themeColor="accent3" w:themeTint="99"/>
+              <w:bottom w:val="single" w:sz="4" w:space="0" w:color="C9C9C9" w:themeColor="accent3" w:themeTint="99"/>
+              <w:right w:val="single" w:sz="4" w:space="0" w:color="C9C9C9" w:themeColor="accent3" w:themeTint="99"/>
+            </w:tcBorders>
+            <w:shd w:val="clear" w:color="auto" w:fill="BDD6EE" w:themeFill="accent1" w:themeFillTint="66"/>
+          </w:tcPr>
+          <w:p>
+            <w:pPr>
+              <w:spacing w:after="0" w:line="240" w:lineRule="auto"/>
+              <w:jc w:val="center"/>
+              <w:rPr>
+                <w:color w:val="002060"/>
+              </w:rPr>
+            </w:pPr>
+            <w:r>
+              <w:rPr>
+                <w:color w:val="002060"/>
+              </w:rPr>
+              <w:t>Process Exclusions Group</w:t>
+            </w:r>
           </w:p>
         </w:tc>
       </w:tr>
@@ -4233,7 +4912,7 @@
         <w:tc>
           <w:tcPr>
             <w:cnfStyle w:val="001000000000" w:firstRow="0" w:lastRow="0" w:firstColumn="1" w:lastColumn="0" w:oddVBand="0" w:evenVBand="0" w:oddHBand="0" w:evenHBand="0" w:firstRowFirstColumn="0" w:firstRowLastColumn="0" w:lastRowFirstColumn="0" w:lastRowLastColumn="0"/>
-            <w:tcW w:w="2830" w:type="dxa"/>
+            <w:tcW w:w="2392" w:type="dxa"/>
             <w:tcBorders>
               <w:top w:val="single" w:sz="4" w:space="0" w:color="C9C9C9" w:themeColor="accent3" w:themeTint="99"/>
               <w:left w:val="single" w:sz="4" w:space="0" w:color="C9C9C9" w:themeColor="accent3" w:themeTint="99"/>
@@ -4253,7 +4932,7 @@
         </w:tc>
         <w:tc>
           <w:tcPr>
-            <w:tcW w:w="7938" w:type="dxa"/>
+            <w:tcW w:w="8398" w:type="dxa"/>
             <w:tcBorders>
               <w:top w:val="single" w:sz="4" w:space="0" w:color="C9C9C9" w:themeColor="accent3" w:themeTint="99"/>
               <w:left w:val="single" w:sz="4" w:space="0" w:color="C9C9C9" w:themeColor="accent3" w:themeTint="99"/>
@@ -4285,42 +4964,29 @@
         <w:tc>
           <w:tcPr>
             <w:cnfStyle w:val="001000000000" w:firstRow="0" w:lastRow="0" w:firstColumn="1" w:lastColumn="0" w:oddVBand="0" w:evenVBand="0" w:oddHBand="0" w:evenHBand="0" w:firstRowFirstColumn="0" w:firstRowLastColumn="0" w:lastRowFirstColumn="0" w:lastRowLastColumn="0"/>
-            <w:tcW w:w="2830" w:type="dxa"/>
-            <w:tcBorders>
-              <w:top w:val="single" w:sz="4" w:space="0" w:color="C9C9C9" w:themeColor="accent3" w:themeTint="99"/>
-              <w:left w:val="single" w:sz="4" w:space="0" w:color="C9C9C9" w:themeColor="accent3" w:themeTint="99"/>
-              <w:bottom w:val="single" w:sz="4" w:space="0" w:color="C9C9C9" w:themeColor="accent3" w:themeTint="99"/>
-              <w:right w:val="single" w:sz="4" w:space="0" w:color="C9C9C9" w:themeColor="accent3" w:themeTint="99"/>
-            </w:tcBorders>
-            <w:hideMark/>
+            <w:tcW w:w="10790" w:type="dxa"/>
+            <w:gridSpan w:val="2"/>
+            <w:tcBorders>
+              <w:top w:val="single" w:sz="4" w:space="0" w:color="C9C9C9" w:themeColor="accent3" w:themeTint="99"/>
+              <w:left w:val="single" w:sz="4" w:space="0" w:color="C9C9C9" w:themeColor="accent3" w:themeTint="99"/>
+              <w:bottom w:val="single" w:sz="4" w:space="0" w:color="C9C9C9" w:themeColor="accent3" w:themeTint="99"/>
+              <w:right w:val="single" w:sz="4" w:space="0" w:color="C9C9C9" w:themeColor="accent3" w:themeTint="99"/>
+            </w:tcBorders>
+            <w:shd w:val="clear" w:color="auto" w:fill="BDD6EE" w:themeFill="accent1" w:themeFillTint="66"/>
           </w:tcPr>
           <w:p>
             <w:pPr>
               <w:spacing w:after="0" w:line="240" w:lineRule="auto"/>
-            </w:pPr>
-            <w:r>
-              <w:t>Reset</w:t>
-            </w:r>
-          </w:p>
-        </w:tc>
-        <w:tc>
-          <w:tcPr>
-            <w:tcW w:w="7938" w:type="dxa"/>
-            <w:tcBorders>
-              <w:top w:val="single" w:sz="4" w:space="0" w:color="C9C9C9" w:themeColor="accent3" w:themeTint="99"/>
-              <w:left w:val="single" w:sz="4" w:space="0" w:color="C9C9C9" w:themeColor="accent3" w:themeTint="99"/>
-              <w:bottom w:val="single" w:sz="4" w:space="0" w:color="C9C9C9" w:themeColor="accent3" w:themeTint="99"/>
-              <w:right w:val="single" w:sz="4" w:space="0" w:color="C9C9C9" w:themeColor="accent3" w:themeTint="99"/>
-            </w:tcBorders>
-            <w:hideMark/>
-          </w:tcPr>
-          <w:p>
-            <w:pPr>
-              <w:spacing w:after="0" w:line="240" w:lineRule="auto"/>
-              <w:cnfStyle w:val="000000000000" w:firstRow="0" w:lastRow="0" w:firstColumn="0" w:lastColumn="0" w:oddVBand="0" w:evenVBand="0" w:oddHBand="0" w:evenHBand="0" w:firstRowFirstColumn="0" w:firstRowLastColumn="0" w:lastRowFirstColumn="0" w:lastRowLastColumn="0"/>
-            </w:pPr>
-            <w:r>
-              <w:t>Reset settings to default settings.</w:t>
+              <w:jc w:val="center"/>
+              <w:rPr>
+                <w:color w:val="002060"/>
+              </w:rPr>
+            </w:pPr>
+            <w:r>
+              <w:rPr>
+                <w:color w:val="002060"/>
+              </w:rPr>
+              <w:t>Other Settings</w:t>
             </w:r>
           </w:p>
         </w:tc>
@@ -4332,32 +4998,34 @@
         <w:tc>
           <w:tcPr>
             <w:cnfStyle w:val="001000000000" w:firstRow="0" w:lastRow="0" w:firstColumn="1" w:lastColumn="0" w:oddVBand="0" w:evenVBand="0" w:oddHBand="0" w:evenHBand="0" w:firstRowFirstColumn="0" w:firstRowLastColumn="0" w:lastRowFirstColumn="0" w:lastRowLastColumn="0"/>
-            <w:tcW w:w="2830" w:type="dxa"/>
-            <w:tcBorders>
-              <w:top w:val="single" w:sz="4" w:space="0" w:color="C9C9C9" w:themeColor="accent3" w:themeTint="99"/>
-              <w:left w:val="single" w:sz="4" w:space="0" w:color="C9C9C9" w:themeColor="accent3" w:themeTint="99"/>
-              <w:bottom w:val="single" w:sz="4" w:space="0" w:color="C9C9C9" w:themeColor="accent3" w:themeTint="99"/>
-              <w:right w:val="single" w:sz="4" w:space="0" w:color="C9C9C9" w:themeColor="accent3" w:themeTint="99"/>
-            </w:tcBorders>
+            <w:tcW w:w="2392" w:type="dxa"/>
+            <w:tcBorders>
+              <w:top w:val="single" w:sz="4" w:space="0" w:color="C9C9C9" w:themeColor="accent3" w:themeTint="99"/>
+              <w:left w:val="single" w:sz="4" w:space="0" w:color="C9C9C9" w:themeColor="accent3" w:themeTint="99"/>
+              <w:bottom w:val="single" w:sz="4" w:space="0" w:color="C9C9C9" w:themeColor="accent3" w:themeTint="99"/>
+              <w:right w:val="single" w:sz="4" w:space="0" w:color="C9C9C9" w:themeColor="accent3" w:themeTint="99"/>
+            </w:tcBorders>
+            <w:hideMark/>
           </w:tcPr>
           <w:p>
             <w:pPr>
               <w:spacing w:after="0" w:line="240" w:lineRule="auto"/>
             </w:pPr>
             <w:r>
-              <w:t>Reload</w:t>
-            </w:r>
-          </w:p>
-        </w:tc>
-        <w:tc>
-          <w:tcPr>
-            <w:tcW w:w="7938" w:type="dxa"/>
-            <w:tcBorders>
-              <w:top w:val="single" w:sz="4" w:space="0" w:color="C9C9C9" w:themeColor="accent3" w:themeTint="99"/>
-              <w:left w:val="single" w:sz="4" w:space="0" w:color="C9C9C9" w:themeColor="accent3" w:themeTint="99"/>
-              <w:bottom w:val="single" w:sz="4" w:space="0" w:color="C9C9C9" w:themeColor="accent3" w:themeTint="99"/>
-              <w:right w:val="single" w:sz="4" w:space="0" w:color="C9C9C9" w:themeColor="accent3" w:themeTint="99"/>
-            </w:tcBorders>
+              <w:t>Reset</w:t>
+            </w:r>
+          </w:p>
+        </w:tc>
+        <w:tc>
+          <w:tcPr>
+            <w:tcW w:w="8398" w:type="dxa"/>
+            <w:tcBorders>
+              <w:top w:val="single" w:sz="4" w:space="0" w:color="C9C9C9" w:themeColor="accent3" w:themeTint="99"/>
+              <w:left w:val="single" w:sz="4" w:space="0" w:color="C9C9C9" w:themeColor="accent3" w:themeTint="99"/>
+              <w:bottom w:val="single" w:sz="4" w:space="0" w:color="C9C9C9" w:themeColor="accent3" w:themeTint="99"/>
+              <w:right w:val="single" w:sz="4" w:space="0" w:color="C9C9C9" w:themeColor="accent3" w:themeTint="99"/>
+            </w:tcBorders>
+            <w:hideMark/>
           </w:tcPr>
           <w:p>
             <w:pPr>
@@ -4365,13 +5033,55 @@
               <w:cnfStyle w:val="000000100000" w:firstRow="0" w:lastRow="0" w:firstColumn="0" w:lastColumn="0" w:oddVBand="0" w:evenVBand="0" w:oddHBand="1" w:evenHBand="0" w:firstRowFirstColumn="0" w:firstRowLastColumn="0" w:lastRowFirstColumn="0" w:lastRowLastColumn="0"/>
             </w:pPr>
             <w:r>
+              <w:t>Reset settings to default settings.</w:t>
+            </w:r>
+          </w:p>
+        </w:tc>
+      </w:tr>
+      <w:tr>
+        <w:tc>
+          <w:tcPr>
+            <w:cnfStyle w:val="001000000000" w:firstRow="0" w:lastRow="0" w:firstColumn="1" w:lastColumn="0" w:oddVBand="0" w:evenVBand="0" w:oddHBand="0" w:evenHBand="0" w:firstRowFirstColumn="0" w:firstRowLastColumn="0" w:lastRowFirstColumn="0" w:lastRowLastColumn="0"/>
+            <w:tcW w:w="2392" w:type="dxa"/>
+            <w:tcBorders>
+              <w:top w:val="single" w:sz="4" w:space="0" w:color="C9C9C9" w:themeColor="accent3" w:themeTint="99"/>
+              <w:left w:val="single" w:sz="4" w:space="0" w:color="C9C9C9" w:themeColor="accent3" w:themeTint="99"/>
+              <w:bottom w:val="single" w:sz="4" w:space="0" w:color="C9C9C9" w:themeColor="accent3" w:themeTint="99"/>
+              <w:right w:val="single" w:sz="4" w:space="0" w:color="C9C9C9" w:themeColor="accent3" w:themeTint="99"/>
+            </w:tcBorders>
+          </w:tcPr>
+          <w:p>
+            <w:pPr>
+              <w:spacing w:after="0" w:line="240" w:lineRule="auto"/>
+            </w:pPr>
+            <w:r>
+              <w:t>Reload</w:t>
+            </w:r>
+          </w:p>
+        </w:tc>
+        <w:tc>
+          <w:tcPr>
+            <w:tcW w:w="8398" w:type="dxa"/>
+            <w:tcBorders>
+              <w:top w:val="single" w:sz="4" w:space="0" w:color="C9C9C9" w:themeColor="accent3" w:themeTint="99"/>
+              <w:left w:val="single" w:sz="4" w:space="0" w:color="C9C9C9" w:themeColor="accent3" w:themeTint="99"/>
+              <w:bottom w:val="single" w:sz="4" w:space="0" w:color="C9C9C9" w:themeColor="accent3" w:themeTint="99"/>
+              <w:right w:val="single" w:sz="4" w:space="0" w:color="C9C9C9" w:themeColor="accent3" w:themeTint="99"/>
+            </w:tcBorders>
+          </w:tcPr>
+          <w:p>
+            <w:pPr>
+              <w:spacing w:after="0" w:line="240" w:lineRule="auto"/>
+              <w:cnfStyle w:val="000000000000" w:firstRow="0" w:lastRow="0" w:firstColumn="0" w:lastColumn="0" w:oddVBand="0" w:evenVBand="0" w:oddHBand="0" w:evenHBand="0" w:firstRowFirstColumn="0" w:firstRowLastColumn="0" w:lastRowFirstColumn="0" w:lastRowLastColumn="0"/>
+            </w:pPr>
+            <w:r>
               <w:t>Reload settings from AltTabSettings.ini file.</w:t>
             </w:r>
           </w:p>
           <w:p>
             <w:pPr>
               <w:spacing w:after="0" w:line="240" w:lineRule="auto"/>
-              <w:cnfStyle w:val="000000100000" w:firstRow="0" w:lastRow="0" w:firstColumn="0" w:lastColumn="0" w:oddVBand="0" w:evenVBand="0" w:oddHBand="1" w:evenHBand="0" w:firstRowFirstColumn="0" w:firstRowLastColumn="0" w:lastRowFirstColumn="0" w:lastRowLastColumn="0"/>
+              <w:cnfStyle w:val="000000000000" w:firstRow="0" w:lastRow="0" w:firstColumn="0" w:lastColumn="0" w:oddVBand="0" w:evenVBand="0" w:oddHBand="0" w:evenHBand="0" w:firstRowFirstColumn="0" w:firstRowLastColumn="0" w:lastRowFirstColumn="0" w:lastRowLastColumn="0"/>
             </w:pPr>
             <w:r>
               <w:t>Use this button if you have modified the settings in the INI file</w:t>
@@ -4386,7 +5096,7 @@
           <w:p>
             <w:pPr>
               <w:spacing w:after="0" w:line="240" w:lineRule="auto"/>
-              <w:cnfStyle w:val="000000100000" w:firstRow="0" w:lastRow="0" w:firstColumn="0" w:lastColumn="0" w:oddVBand="0" w:evenVBand="0" w:oddHBand="1" w:evenHBand="0" w:firstRowFirstColumn="0" w:firstRowLastColumn="0" w:lastRowFirstColumn="0" w:lastRowLastColumn="0"/>
+              <w:cnfStyle w:val="000000000000" w:firstRow="0" w:lastRow="0" w:firstColumn="0" w:lastColumn="0" w:oddVBand="0" w:evenVBand="0" w:oddHBand="0" w:evenHBand="0" w:firstRowFirstColumn="0" w:firstRowLastColumn="0" w:lastRowFirstColumn="0" w:lastRowLastColumn="0"/>
             </w:pPr>
             <w:r>
               <w:t xml:space="preserve">Alternative method: </w:t>

</xml_diff>